<commit_message>
ajuste busca cartao cbf
</commit_message>
<xml_diff>
--- a/anotacao/Anotacao.docx
+++ b/anotacao/Anotacao.docx
@@ -3,37 +3,64 @@
 <w:document xmlns:wpc="http://schemas.microsoft.com/office/word/2010/wordprocessingCanvas" xmlns:cx="http://schemas.microsoft.com/office/drawing/2014/chartex" xmlns:cx1="http://schemas.microsoft.com/office/drawing/2015/9/8/chartex" xmlns:cx2="http://schemas.microsoft.com/office/drawing/2015/10/21/chartex" xmlns:cx3="http://schemas.microsoft.com/office/drawing/2016/5/9/chartex" xmlns:cx4="http://schemas.microsoft.com/office/drawing/2016/5/10/chartex" xmlns:cx5="http://schemas.microsoft.com/office/drawing/2016/5/11/chartex" xmlns:cx6="http://schemas.microsoft.com/office/drawing/2016/5/12/chartex" xmlns:cx7="http://schemas.microsoft.com/office/drawing/2016/5/13/chartex" xmlns:cx8="http://schemas.microsoft.com/office/drawing/2016/5/14/chartex" xmlns:mc="http://schemas.openxmlformats.org/markup-compatibility/2006" xmlns:aink="http://schemas.microsoft.com/office/drawing/2016/ink" xmlns:am3d="http://schemas.microsoft.com/office/drawing/2017/model3d" xmlns:o="urn:schemas-microsoft-com:office:office" xmlns:r="http://schemas.openxmlformats.org/officeDocument/2006/relationships" xmlns:m="http://schemas.openxmlformats.org/officeDocument/2006/math" xmlns:v="urn:schemas-microsoft-com:vml" xmlns:wp14="http://schemas.microsoft.com/office/word/2010/wordprocessingDrawing" xmlns:wp="http://schemas.openxmlformats.org/drawingml/2006/wordprocessingDrawing" xmlns:w10="urn:schemas-microsoft-com:office:word" xmlns:w="http://schemas.openxmlformats.org/wordprocessingml/2006/main" xmlns:w14="http://schemas.microsoft.com/office/word/2010/wordml" xmlns:w15="http://schemas.microsoft.com/office/word/2012/wordml" xmlns:w16cex="http://schemas.microsoft.com/office/word/2018/wordml/cex" xmlns:w16cid="http://schemas.microsoft.com/office/word/2016/wordml/cid" xmlns:w16="http://schemas.microsoft.com/office/word/2018/wordml" xmlns:w16se="http://schemas.microsoft.com/office/word/2015/wordml/symex" xmlns:wpg="http://schemas.microsoft.com/office/word/2010/wordprocessingGroup" xmlns:wpi="http://schemas.microsoft.com/office/word/2010/wordprocessingInk" xmlns:wne="http://schemas.microsoft.com/office/word/2006/wordml" xmlns:wps="http://schemas.microsoft.com/office/word/2010/wordprocessingShape" mc:Ignorable="w14 w15 w16se w16cid w16 w16cex wp14">
   <w:body>
     <w:p>
-      <w:proofErr w:type="spellStart"/>
-      <w:r>
-        <w:t>Estatística</w:t>
-      </w:r>
-      <w:proofErr w:type="spellEnd"/>
-      <w:r>
-        <w:t xml:space="preserve"> Serie B 2025</w:t>
-      </w:r>
-    </w:p>
-    <w:p>
+      <w:pPr>
+        <w:rPr>
+          <w:lang w:val="pt-BR"/>
+        </w:rPr>
+      </w:pPr>
+      <w:r>
+        <w:rPr>
+          <w:lang w:val="pt-BR"/>
+        </w:rPr>
+        <w:t>Estatística Serie B 2025</w:t>
+      </w:r>
+    </w:p>
+    <w:p>
+      <w:pPr>
+        <w:rPr>
+          <w:lang w:val="pt-BR"/>
+        </w:rPr>
+      </w:pPr>
       <w:hyperlink r:id="rId7" w:history="1">
         <w:r>
           <w:rPr>
             <w:rStyle w:val="Hyperlink"/>
+            <w:lang w:val="pt-BR"/>
           </w:rPr>
           <w:t>https://www.cbf.com.br/futebol-brasileiro/tabelas/campeonato-brasileiro/serie-b/2025</w:t>
         </w:r>
       </w:hyperlink>
     </w:p>
-    <w:p/>
-    <w:p>
+    <w:p>
+      <w:pPr>
+        <w:rPr>
+          <w:lang w:val="pt-BR"/>
+        </w:rPr>
+      </w:pPr>
+    </w:p>
+    <w:p>
+      <w:pPr>
+        <w:rPr>
+          <w:lang w:val="pt-BR"/>
+        </w:rPr>
+      </w:pPr>
       <w:hyperlink r:id="rId8" w:history="1">
         <w:r>
           <w:rPr>
             <w:rStyle w:val="Hyperlink"/>
+            <w:lang w:val="pt-BR"/>
           </w:rPr>
           <w:t>https://www.fotmob.com/pt-BR/leagues/8814/overview/serie-b</w:t>
         </w:r>
       </w:hyperlink>
     </w:p>
-    <w:p/>
+    <w:p>
+      <w:pPr>
+        <w:rPr>
+          <w:lang w:val="pt-BR"/>
+        </w:rPr>
+      </w:pPr>
+    </w:p>
     <w:p>
       <w:pPr>
         <w:spacing w:before="100" w:beforeAutospacing="1" w:after="100" w:afterAutospacing="1" w:line="240" w:lineRule="auto"/>
@@ -2525,21 +2552,7 @@
             <w:rStyle w:val="Hyperlink"/>
             <w:lang w:val="pt-BR"/>
           </w:rPr>
-          <w:t>https://youtu.be/NsjA-c8596k?si=jCySsYQFk7H</w:t>
-        </w:r>
-        <w:r>
-          <w:rPr>
-            <w:rStyle w:val="Hyperlink"/>
-            <w:lang w:val="pt-BR"/>
-          </w:rPr>
-          <w:t>_</w:t>
-        </w:r>
-        <w:r>
-          <w:rPr>
-            <w:rStyle w:val="Hyperlink"/>
-            <w:lang w:val="pt-BR"/>
-          </w:rPr>
-          <w:t>tAH9</w:t>
+          <w:t>https://youtu.be/NsjA-c8596k?si=jCySsYQFk7H_tAH9</w:t>
         </w:r>
       </w:hyperlink>
     </w:p>
@@ -2594,150 +2607,6 @@
         </w:rPr>
         <w:t xml:space="preserve"> - Aula 2 - Filtros e Gráficos</w:t>
       </w:r>
-    </w:p>
-    <w:bookmarkStart w:id="0" w:name="_GoBack"/>
-    <w:bookmarkEnd w:id="0"/>
-    <w:p>
-      <w:pPr>
-        <w:rPr>
-          <w:lang w:val="pt-BR"/>
-        </w:rPr>
-      </w:pPr>
-      <w:r>
-        <w:rPr>
-          <w:lang w:val="pt-BR"/>
-        </w:rPr>
-        <w:fldChar w:fldCharType="begin"/>
-      </w:r>
-      <w:r>
-        <w:rPr>
-          <w:lang w:val="pt-BR"/>
-        </w:rPr>
-        <w:instrText xml:space="preserve"> HYPERLINK "</w:instrText>
-      </w:r>
-      <w:r>
-        <w:rPr>
-          <w:lang w:val="pt-BR"/>
-        </w:rPr>
-        <w:instrText>https://youtu.be/fUuBo759oqg?si=N1X2rq3i7f8MGvSD</w:instrText>
-      </w:r>
-      <w:r>
-        <w:rPr>
-          <w:lang w:val="pt-BR"/>
-        </w:rPr>
-        <w:instrText xml:space="preserve">" </w:instrText>
-      </w:r>
-      <w:r>
-        <w:rPr>
-          <w:lang w:val="pt-BR"/>
-        </w:rPr>
-        <w:fldChar w:fldCharType="separate"/>
-      </w:r>
-      <w:r>
-        <w:rPr>
-          <w:rStyle w:val="Hyperlink"/>
-          <w:lang w:val="pt-BR"/>
-        </w:rPr>
-        <w:t>https://youtu.be/fUuBo759oqg?si=N1X2rq3i7f8MGvSD</w:t>
-      </w:r>
-      <w:r>
-        <w:rPr>
-          <w:lang w:val="pt-BR"/>
-        </w:rPr>
-        <w:fldChar w:fldCharType="end"/>
-      </w:r>
-    </w:p>
-    <w:p>
-      <w:pPr>
-        <w:spacing w:before="100" w:beforeAutospacing="1" w:after="100" w:afterAutospacing="1" w:line="240" w:lineRule="auto"/>
-        <w:rPr>
-          <w:rFonts w:ascii="Times New Roman" w:eastAsia="Times New Roman" w:hAnsi="Times New Roman" w:cs="Times New Roman"/>
-          <w:b/>
-          <w:bCs/>
-          <w:color w:val="000000"/>
-          <w:sz w:val="24"/>
-          <w:szCs w:val="24"/>
-          <w:lang w:val="pt-BR"/>
-        </w:rPr>
-      </w:pPr>
-      <w:r>
-        <w:rPr>
-          <w:rFonts w:ascii="Times New Roman" w:eastAsia="Times New Roman" w:hAnsi="Times New Roman" w:cs="Times New Roman"/>
-          <w:b/>
-          <w:bCs/>
-          <w:color w:val="000000"/>
-          <w:sz w:val="24"/>
-          <w:szCs w:val="24"/>
-          <w:lang w:val="pt-BR"/>
-        </w:rPr>
-        <w:t xml:space="preserve">Curso de </w:t>
-      </w:r>
-      <w:proofErr w:type="spellStart"/>
-      <w:r>
-        <w:rPr>
-          <w:rFonts w:ascii="Times New Roman" w:eastAsia="Times New Roman" w:hAnsi="Times New Roman" w:cs="Times New Roman"/>
-          <w:b/>
-          <w:bCs/>
-          <w:color w:val="000000"/>
-          <w:sz w:val="24"/>
-          <w:szCs w:val="24"/>
-          <w:lang w:val="pt-BR"/>
-        </w:rPr>
-        <w:t>Streamlit</w:t>
-      </w:r>
-      <w:proofErr w:type="spellEnd"/>
-      <w:r>
-        <w:rPr>
-          <w:rFonts w:ascii="Times New Roman" w:eastAsia="Times New Roman" w:hAnsi="Times New Roman" w:cs="Times New Roman"/>
-          <w:b/>
-          <w:bCs/>
-          <w:color w:val="000000"/>
-          <w:sz w:val="24"/>
-          <w:szCs w:val="24"/>
-          <w:lang w:val="pt-BR"/>
-        </w:rPr>
-        <w:t xml:space="preserve"> - Aula 3 - </w:t>
-      </w:r>
-      <w:proofErr w:type="spellStart"/>
-      <w:r>
-        <w:rPr>
-          <w:rFonts w:ascii="Times New Roman" w:eastAsia="Times New Roman" w:hAnsi="Times New Roman" w:cs="Times New Roman"/>
-          <w:b/>
-          <w:bCs/>
-          <w:color w:val="000000"/>
-          <w:sz w:val="24"/>
-          <w:szCs w:val="24"/>
-          <w:lang w:val="pt-BR"/>
-        </w:rPr>
-        <w:t>Sidebar</w:t>
-      </w:r>
-      <w:proofErr w:type="spellEnd"/>
-      <w:r>
-        <w:rPr>
-          <w:rFonts w:ascii="Times New Roman" w:eastAsia="Times New Roman" w:hAnsi="Times New Roman" w:cs="Times New Roman"/>
-          <w:b/>
-          <w:bCs/>
-          <w:color w:val="000000"/>
-          <w:sz w:val="24"/>
-          <w:szCs w:val="24"/>
-          <w:lang w:val="pt-BR"/>
-        </w:rPr>
-        <w:t xml:space="preserve">, Datas e </w:t>
-      </w:r>
-      <w:proofErr w:type="spellStart"/>
-      <w:r>
-        <w:rPr>
-          <w:rFonts w:ascii="Times New Roman" w:eastAsia="Times New Roman" w:hAnsi="Times New Roman" w:cs="Times New Roman"/>
-          <w:b/>
-          <w:bCs/>
-          <w:color w:val="000000"/>
-          <w:sz w:val="24"/>
-          <w:szCs w:val="24"/>
-          <w:lang w:val="pt-BR"/>
-        </w:rPr>
-        <w:t>Sliders</w:t>
-      </w:r>
-      <w:proofErr w:type="spellEnd"/>
     </w:p>
     <w:p>
       <w:pPr>
@@ -2751,21 +2620,7 @@
             <w:rStyle w:val="Hyperlink"/>
             <w:lang w:val="pt-BR"/>
           </w:rPr>
-          <w:t>https://youtu.be/AbQxN</w:t>
-        </w:r>
-        <w:r>
-          <w:rPr>
-            <w:rStyle w:val="Hyperlink"/>
-            <w:lang w:val="pt-BR"/>
-          </w:rPr>
-          <w:t>U</w:t>
-        </w:r>
-        <w:r>
-          <w:rPr>
-            <w:rStyle w:val="Hyperlink"/>
-            <w:lang w:val="pt-BR"/>
-          </w:rPr>
-          <w:t>vjwv8?si=WaAEvF6womjezK_D</w:t>
+          <w:t>https://youtu.be/fUuBo759oqg?si=N1X2rq3i7f8MGvSD</w:t>
         </w:r>
       </w:hyperlink>
     </w:p>
@@ -2873,33 +2728,120 @@
             <w:rStyle w:val="Hyperlink"/>
             <w:lang w:val="pt-BR"/>
           </w:rPr>
-          <w:t>https://youtu.be/AbQx</w:t>
+          <w:t>https://youtu.be/AbQxNUvjwv8?si=WaAEvF6womjezK_D</w:t>
         </w:r>
+      </w:hyperlink>
+    </w:p>
+    <w:p>
+      <w:pPr>
+        <w:spacing w:before="100" w:beforeAutospacing="1" w:after="100" w:afterAutospacing="1" w:line="240" w:lineRule="auto"/>
+        <w:rPr>
+          <w:rFonts w:ascii="Times New Roman" w:eastAsia="Times New Roman" w:hAnsi="Times New Roman" w:cs="Times New Roman"/>
+          <w:b/>
+          <w:bCs/>
+          <w:color w:val="000000"/>
+          <w:sz w:val="24"/>
+          <w:szCs w:val="24"/>
+          <w:lang w:val="pt-BR"/>
+        </w:rPr>
+      </w:pPr>
+      <w:r>
+        <w:rPr>
+          <w:rFonts w:ascii="Times New Roman" w:eastAsia="Times New Roman" w:hAnsi="Times New Roman" w:cs="Times New Roman"/>
+          <w:b/>
+          <w:bCs/>
+          <w:color w:val="000000"/>
+          <w:sz w:val="24"/>
+          <w:szCs w:val="24"/>
+          <w:lang w:val="pt-BR"/>
+        </w:rPr>
+        <w:t xml:space="preserve">Curso de </w:t>
+      </w:r>
+      <w:proofErr w:type="spellStart"/>
+      <w:r>
+        <w:rPr>
+          <w:rFonts w:ascii="Times New Roman" w:eastAsia="Times New Roman" w:hAnsi="Times New Roman" w:cs="Times New Roman"/>
+          <w:b/>
+          <w:bCs/>
+          <w:color w:val="000000"/>
+          <w:sz w:val="24"/>
+          <w:szCs w:val="24"/>
+          <w:lang w:val="pt-BR"/>
+        </w:rPr>
+        <w:t>Streamlit</w:t>
+      </w:r>
+      <w:proofErr w:type="spellEnd"/>
+      <w:r>
+        <w:rPr>
+          <w:rFonts w:ascii="Times New Roman" w:eastAsia="Times New Roman" w:hAnsi="Times New Roman" w:cs="Times New Roman"/>
+          <w:b/>
+          <w:bCs/>
+          <w:color w:val="000000"/>
+          <w:sz w:val="24"/>
+          <w:szCs w:val="24"/>
+          <w:lang w:val="pt-BR"/>
+        </w:rPr>
+        <w:t xml:space="preserve"> - Aula 3 - </w:t>
+      </w:r>
+      <w:proofErr w:type="spellStart"/>
+      <w:r>
+        <w:rPr>
+          <w:rFonts w:ascii="Times New Roman" w:eastAsia="Times New Roman" w:hAnsi="Times New Roman" w:cs="Times New Roman"/>
+          <w:b/>
+          <w:bCs/>
+          <w:color w:val="000000"/>
+          <w:sz w:val="24"/>
+          <w:szCs w:val="24"/>
+          <w:lang w:val="pt-BR"/>
+        </w:rPr>
+        <w:t>Sidebar</w:t>
+      </w:r>
+      <w:proofErr w:type="spellEnd"/>
+      <w:r>
+        <w:rPr>
+          <w:rFonts w:ascii="Times New Roman" w:eastAsia="Times New Roman" w:hAnsi="Times New Roman" w:cs="Times New Roman"/>
+          <w:b/>
+          <w:bCs/>
+          <w:color w:val="000000"/>
+          <w:sz w:val="24"/>
+          <w:szCs w:val="24"/>
+          <w:lang w:val="pt-BR"/>
+        </w:rPr>
+        <w:t xml:space="preserve">, Datas e </w:t>
+      </w:r>
+      <w:proofErr w:type="spellStart"/>
+      <w:r>
+        <w:rPr>
+          <w:rFonts w:ascii="Times New Roman" w:eastAsia="Times New Roman" w:hAnsi="Times New Roman" w:cs="Times New Roman"/>
+          <w:b/>
+          <w:bCs/>
+          <w:color w:val="000000"/>
+          <w:sz w:val="24"/>
+          <w:szCs w:val="24"/>
+          <w:lang w:val="pt-BR"/>
+        </w:rPr>
+        <w:t>Sliders</w:t>
+      </w:r>
+      <w:proofErr w:type="spellEnd"/>
+    </w:p>
+    <w:p>
+      <w:pPr>
+        <w:rPr>
+          <w:lang w:val="pt-BR"/>
+        </w:rPr>
+      </w:pPr>
+      <w:hyperlink r:id="rId12" w:history="1">
         <w:r>
           <w:rPr>
             <w:rStyle w:val="Hyperlink"/>
             <w:lang w:val="pt-BR"/>
           </w:rPr>
-          <w:t>N</w:t>
-        </w:r>
-        <w:r>
-          <w:rPr>
-            <w:rStyle w:val="Hyperlink"/>
-            <w:lang w:val="pt-BR"/>
-          </w:rPr>
-          <w:t>Uvjwv8?si=--nm_aTwb1HoEmBT</w:t>
+          <w:t>https://youtu.be/AbQxNUvjwv8?si=--nm_aTwb1HoEmBT</w:t>
         </w:r>
       </w:hyperlink>
     </w:p>
     <w:p>
       <w:pPr>
-        <w:rPr>
-          <w:lang w:val="pt-BR"/>
-        </w:rPr>
-      </w:pPr>
-    </w:p>
-    <w:p>
-      <w:pPr>
         <w:spacing w:before="100" w:beforeAutospacing="1" w:after="100" w:afterAutospacing="1" w:line="240" w:lineRule="auto"/>
         <w:rPr>
           <w:rFonts w:ascii="Times New Roman" w:eastAsia="Times New Roman" w:hAnsi="Times New Roman" w:cs="Times New Roman"/>
@@ -2953,10 +2895,11 @@
     <w:p>
       <w:pPr>
         <w:rPr>
-          <w:lang w:val="pt-BR"/>
-        </w:rPr>
-      </w:pPr>
-      <w:hyperlink r:id="rId12" w:history="1">
+          <w:rStyle w:val="Hyperlink"/>
+          <w:lang w:val="pt-BR"/>
+        </w:rPr>
+      </w:pPr>
+      <w:hyperlink r:id="rId13" w:history="1">
         <w:r>
           <w:rPr>
             <w:rStyle w:val="Hyperlink"/>
@@ -2968,6 +2911,282 @@
     </w:p>
     <w:p>
       <w:pPr>
+        <w:spacing w:before="100" w:beforeAutospacing="1" w:after="100" w:afterAutospacing="1" w:line="240" w:lineRule="auto"/>
+        <w:rPr>
+          <w:rFonts w:ascii="Times New Roman" w:eastAsia="Times New Roman" w:hAnsi="Times New Roman" w:cs="Times New Roman"/>
+          <w:b/>
+          <w:bCs/>
+          <w:color w:val="000000"/>
+          <w:sz w:val="24"/>
+          <w:szCs w:val="24"/>
+          <w:lang w:val="pt-BR"/>
+        </w:rPr>
+      </w:pPr>
+      <w:proofErr w:type="spellStart"/>
+      <w:r>
+        <w:rPr>
+          <w:rFonts w:ascii="Times New Roman" w:eastAsia="Times New Roman" w:hAnsi="Times New Roman" w:cs="Times New Roman"/>
+          <w:b/>
+          <w:bCs/>
+          <w:color w:val="000000"/>
+          <w:sz w:val="24"/>
+          <w:szCs w:val="24"/>
+          <w:lang w:val="pt-BR"/>
+        </w:rPr>
+        <w:lastRenderedPageBreak/>
+        <w:t>Deploy</w:t>
+      </w:r>
+      <w:proofErr w:type="spellEnd"/>
+      <w:r>
+        <w:rPr>
+          <w:rFonts w:ascii="Times New Roman" w:eastAsia="Times New Roman" w:hAnsi="Times New Roman" w:cs="Times New Roman"/>
+          <w:b/>
+          <w:bCs/>
+          <w:color w:val="000000"/>
+          <w:sz w:val="24"/>
+          <w:szCs w:val="24"/>
+          <w:lang w:val="pt-BR"/>
+        </w:rPr>
+        <w:t xml:space="preserve"> com o </w:t>
+      </w:r>
+      <w:proofErr w:type="spellStart"/>
+      <w:r>
+        <w:rPr>
+          <w:rFonts w:ascii="Times New Roman" w:eastAsia="Times New Roman" w:hAnsi="Times New Roman" w:cs="Times New Roman"/>
+          <w:b/>
+          <w:bCs/>
+          <w:color w:val="000000"/>
+          <w:sz w:val="24"/>
+          <w:szCs w:val="24"/>
+          <w:lang w:val="pt-BR"/>
+        </w:rPr>
+        <w:t>Streamlit</w:t>
+      </w:r>
+      <w:proofErr w:type="spellEnd"/>
+      <w:r>
+        <w:rPr>
+          <w:rFonts w:ascii="Times New Roman" w:eastAsia="Times New Roman" w:hAnsi="Times New Roman" w:cs="Times New Roman"/>
+          <w:b/>
+          <w:bCs/>
+          <w:color w:val="000000"/>
+          <w:sz w:val="24"/>
+          <w:szCs w:val="24"/>
+          <w:lang w:val="pt-BR"/>
+        </w:rPr>
+        <w:t xml:space="preserve"> - Como Colocar seu Site no Ar</w:t>
+      </w:r>
+    </w:p>
+    <w:p>
+      <w:pPr>
+        <w:rPr>
+          <w:lang w:val="pt-BR"/>
+        </w:rPr>
+      </w:pPr>
+      <w:hyperlink r:id="rId14" w:history="1">
+        <w:r>
+          <w:rPr>
+            <w:rStyle w:val="Hyperlink"/>
+            <w:lang w:val="pt-BR"/>
+          </w:rPr>
+          <w:t>https://youtu.be/vw0I8i7QJRk?si=_ncf9_4f4RK6_s0L</w:t>
+        </w:r>
+      </w:hyperlink>
+    </w:p>
+    <w:p>
+      <w:pPr>
+        <w:rPr>
+          <w:lang w:val="pt-BR"/>
+        </w:rPr>
+      </w:pPr>
+    </w:p>
+    <w:p>
+      <w:pPr>
+        <w:rPr>
+          <w:lang w:val="pt-BR"/>
+        </w:rPr>
+      </w:pPr>
+    </w:p>
+    <w:p>
+      <w:pPr>
+        <w:pStyle w:val="Ttulo1"/>
+        <w:shd w:val="clear" w:color="auto" w:fill="FFFFFF"/>
+        <w:spacing w:before="0" w:line="420" w:lineRule="atLeast"/>
+        <w:rPr>
+          <w:rFonts w:ascii="Arial" w:hAnsi="Arial" w:cs="Arial"/>
+          <w:color w:val="0F0F0F"/>
+          <w:sz w:val="30"/>
+          <w:szCs w:val="30"/>
+          <w:lang w:val="pt-BR"/>
+        </w:rPr>
+      </w:pPr>
+      <w:r>
+        <w:rPr>
+          <w:rFonts w:ascii="Arial" w:hAnsi="Arial" w:cs="Arial"/>
+          <w:color w:val="0F0F0F"/>
+          <w:sz w:val="30"/>
+          <w:szCs w:val="30"/>
+          <w:lang w:val="pt-BR"/>
+        </w:rPr>
+        <w:t>Aula 01 | COMO Criar Seu Primeiro App em Python com Streamlit | Passo a Passo!</w:t>
+      </w:r>
+    </w:p>
+    <w:p>
+      <w:pPr>
+        <w:rPr>
+          <w:lang w:val="pt-BR"/>
+        </w:rPr>
+      </w:pPr>
+    </w:p>
+    <w:p>
+      <w:pPr>
+        <w:rPr>
+          <w:lang w:val="pt-BR"/>
+        </w:rPr>
+      </w:pPr>
+      <w:hyperlink r:id="rId15" w:history="1">
+        <w:r>
+          <w:rPr>
+            <w:rStyle w:val="Hyperlink"/>
+            <w:lang w:val="pt-BR"/>
+          </w:rPr>
+          <w:t>https://youtu.be/6etEEb-KOYQ?si=5lSZMseSheVbqwdQ</w:t>
+        </w:r>
+      </w:hyperlink>
+    </w:p>
+    <w:p>
+      <w:pPr>
+        <w:rPr>
+          <w:lang w:val="pt-BR"/>
+        </w:rPr>
+      </w:pPr>
+    </w:p>
+    <w:p>
+      <w:pPr>
+        <w:pStyle w:val="Ttulo1"/>
+        <w:shd w:val="clear" w:color="auto" w:fill="FFFFFF"/>
+        <w:spacing w:before="0" w:line="420" w:lineRule="atLeast"/>
+        <w:rPr>
+          <w:rFonts w:ascii="Arial" w:hAnsi="Arial" w:cs="Arial"/>
+          <w:color w:val="0F0F0F"/>
+          <w:sz w:val="30"/>
+          <w:szCs w:val="30"/>
+          <w:lang w:val="pt-BR"/>
+        </w:rPr>
+      </w:pPr>
+      <w:r>
+        <w:rPr>
+          <w:rFonts w:ascii="Arial" w:hAnsi="Arial" w:cs="Arial"/>
+          <w:color w:val="0F0F0F"/>
+          <w:sz w:val="30"/>
+          <w:szCs w:val="30"/>
+          <w:lang w:val="pt-BR"/>
+        </w:rPr>
+        <w:t xml:space="preserve">Python + </w:t>
+      </w:r>
+      <w:proofErr w:type="spellStart"/>
+      <w:r>
+        <w:rPr>
+          <w:rFonts w:ascii="Arial" w:hAnsi="Arial" w:cs="Arial"/>
+          <w:color w:val="0F0F0F"/>
+          <w:sz w:val="30"/>
+          <w:szCs w:val="30"/>
+          <w:lang w:val="pt-BR"/>
+        </w:rPr>
+        <w:t>Streamlit</w:t>
+      </w:r>
+      <w:proofErr w:type="spellEnd"/>
+      <w:r>
+        <w:rPr>
+          <w:rFonts w:ascii="Arial" w:hAnsi="Arial" w:cs="Arial"/>
+          <w:color w:val="0F0F0F"/>
+          <w:sz w:val="30"/>
+          <w:szCs w:val="30"/>
+          <w:lang w:val="pt-BR"/>
+        </w:rPr>
+        <w:t xml:space="preserve"> – Aula 02 | Criando um Formulário de Cadastro com Validações em Python</w:t>
+      </w:r>
+    </w:p>
+    <w:p>
+      <w:pPr>
+        <w:rPr>
+          <w:lang w:val="pt-BR"/>
+        </w:rPr>
+      </w:pPr>
+    </w:p>
+    <w:p>
+      <w:pPr>
+        <w:rPr>
+          <w:lang w:val="pt-BR"/>
+        </w:rPr>
+      </w:pPr>
+      <w:hyperlink r:id="rId16" w:history="1">
+        <w:r>
+          <w:rPr>
+            <w:rStyle w:val="Hyperlink"/>
+            <w:lang w:val="pt-BR"/>
+          </w:rPr>
+          <w:t>https://youtu.be/aXYu8v9xHX0?si=TOMkgRO5t6S5Td4a</w:t>
+        </w:r>
+      </w:hyperlink>
+    </w:p>
+    <w:p>
+      <w:pPr>
+        <w:rPr>
+          <w:lang w:val="pt-BR"/>
+        </w:rPr>
+      </w:pPr>
+    </w:p>
+    <w:p>
+      <w:pPr>
+        <w:pStyle w:val="Ttulo1"/>
+        <w:shd w:val="clear" w:color="auto" w:fill="FFFFFF"/>
+        <w:spacing w:before="0" w:line="420" w:lineRule="atLeast"/>
+        <w:rPr>
+          <w:rFonts w:ascii="Arial" w:hAnsi="Arial" w:cs="Arial"/>
+          <w:color w:val="0F0F0F"/>
+          <w:sz w:val="30"/>
+          <w:szCs w:val="30"/>
+          <w:lang w:val="pt-BR"/>
+        </w:rPr>
+      </w:pPr>
+      <w:r>
+        <w:rPr>
+          <w:rFonts w:ascii="Arial" w:hAnsi="Arial" w:cs="Arial"/>
+          <w:color w:val="0F0F0F"/>
+          <w:sz w:val="30"/>
+          <w:szCs w:val="30"/>
+          <w:lang w:val="pt-BR"/>
+        </w:rPr>
+        <w:t>Nova versão do Streamlit (1.46.0) - Navbar nativa em apps Python</w:t>
+      </w:r>
+    </w:p>
+    <w:p>
+      <w:pPr>
+        <w:rPr>
+          <w:lang w:val="pt-BR"/>
+        </w:rPr>
+      </w:pPr>
+      <w:bookmarkStart w:id="0" w:name="_GoBack"/>
+      <w:bookmarkEnd w:id="0"/>
+    </w:p>
+    <w:p>
+      <w:pPr>
+        <w:rPr>
+          <w:lang w:val="pt-BR"/>
+        </w:rPr>
+      </w:pPr>
+      <w:hyperlink r:id="rId17" w:history="1">
+        <w:r>
+          <w:rPr>
+            <w:rStyle w:val="Hyperlink"/>
+            <w:lang w:val="pt-BR"/>
+          </w:rPr>
+          <w:t>https://youtu.be/2_d1tqtJ5HY?si=bWMm4ybM8IFyDWQx</w:t>
+        </w:r>
+      </w:hyperlink>
+    </w:p>
+    <w:p>
+      <w:pPr>
         <w:rPr>
           <w:lang w:val="pt-BR"/>
         </w:rPr>
@@ -3009,7 +3228,7 @@
       </w:pPr>
     </w:p>
     <w:sectPr>
-      <w:headerReference w:type="default" r:id="rId13"/>
+      <w:headerReference w:type="default" r:id="rId18"/>
       <w:pgSz w:w="12240" w:h="15840"/>
       <w:pgMar w:top="720" w:right="720" w:bottom="720" w:left="720" w:header="708" w:footer="708" w:gutter="0"/>
       <w:cols w:space="708"/>

</xml_diff>

<commit_message>
Remove venv do versionamento
</commit_message>
<xml_diff>
--- a/anotacao/Anotacao.docx
+++ b/anotacao/Anotacao.docx
@@ -80,20 +80,20 @@
           <w:szCs w:val="24"/>
           <w:lang w:val="pt-BR"/>
         </w:rPr>
-        <w:t>Aqui está um comparativo dos principais frameworks e bibliotecas de front-</w:t>
+        <w:t xml:space="preserve">Aqui está um comparativo dos principais frameworks e bibliotecas de front-end baseados em Python que podem ser integrados com um projeto back-end em </w:t>
       </w:r>
-      <w:proofErr w:type="spellStart"/>
       <w:r>
         <w:rPr>
           <w:rFonts w:ascii="Times New Roman" w:eastAsia="Times New Roman" w:hAnsi="Times New Roman" w:cs="Times New Roman"/>
+          <w:b/>
+          <w:bCs/>
           <w:color w:val="000000"/>
           <w:sz w:val="24"/>
           <w:szCs w:val="24"/>
           <w:lang w:val="pt-BR"/>
         </w:rPr>
-        <w:t>end</w:t>
+        <w:t>FastAPI</w:t>
       </w:r>
-      <w:proofErr w:type="spellEnd"/>
       <w:r>
         <w:rPr>
           <w:rFonts w:ascii="Times New Roman" w:eastAsia="Times New Roman" w:hAnsi="Times New Roman" w:cs="Times New Roman"/>
@@ -102,75 +102,7 @@
           <w:szCs w:val="24"/>
           <w:lang w:val="pt-BR"/>
         </w:rPr>
-        <w:t xml:space="preserve"> baseados em Python que podem ser integrados com um projeto </w:t>
-      </w:r>
-      <w:proofErr w:type="spellStart"/>
-      <w:r>
-        <w:rPr>
-          <w:rFonts w:ascii="Times New Roman" w:eastAsia="Times New Roman" w:hAnsi="Times New Roman" w:cs="Times New Roman"/>
-          <w:color w:val="000000"/>
-          <w:sz w:val="24"/>
-          <w:szCs w:val="24"/>
-          <w:lang w:val="pt-BR"/>
-        </w:rPr>
-        <w:t>back-end</w:t>
-      </w:r>
-      <w:proofErr w:type="spellEnd"/>
-      <w:r>
-        <w:rPr>
-          <w:rFonts w:ascii="Times New Roman" w:eastAsia="Times New Roman" w:hAnsi="Times New Roman" w:cs="Times New Roman"/>
-          <w:color w:val="000000"/>
-          <w:sz w:val="24"/>
-          <w:szCs w:val="24"/>
-          <w:lang w:val="pt-BR"/>
-        </w:rPr>
-        <w:t xml:space="preserve"> em </w:t>
-      </w:r>
-      <w:proofErr w:type="spellStart"/>
-      <w:r>
-        <w:rPr>
-          <w:rFonts w:ascii="Times New Roman" w:eastAsia="Times New Roman" w:hAnsi="Times New Roman" w:cs="Times New Roman"/>
-          <w:b/>
-          <w:bCs/>
-          <w:color w:val="000000"/>
-          <w:sz w:val="24"/>
-          <w:szCs w:val="24"/>
-          <w:lang w:val="pt-BR"/>
-        </w:rPr>
-        <w:t>FastAPI</w:t>
-      </w:r>
-      <w:proofErr w:type="spellEnd"/>
-      <w:r>
-        <w:rPr>
-          <w:rFonts w:ascii="Times New Roman" w:eastAsia="Times New Roman" w:hAnsi="Times New Roman" w:cs="Times New Roman"/>
-          <w:color w:val="000000"/>
-          <w:sz w:val="24"/>
-          <w:szCs w:val="24"/>
-          <w:lang w:val="pt-BR"/>
-        </w:rPr>
-        <w:t xml:space="preserve">. A tabela inclui informações como curva de aprendizado, popularidade, flexibilidade e integração com </w:t>
-      </w:r>
-      <w:proofErr w:type="spellStart"/>
-      <w:r>
-        <w:rPr>
-          <w:rFonts w:ascii="Times New Roman" w:eastAsia="Times New Roman" w:hAnsi="Times New Roman" w:cs="Times New Roman"/>
-          <w:color w:val="000000"/>
-          <w:sz w:val="24"/>
-          <w:szCs w:val="24"/>
-          <w:lang w:val="pt-BR"/>
-        </w:rPr>
-        <w:t>FastAPI</w:t>
-      </w:r>
-      <w:proofErr w:type="spellEnd"/>
-      <w:r>
-        <w:rPr>
-          <w:rFonts w:ascii="Times New Roman" w:eastAsia="Times New Roman" w:hAnsi="Times New Roman" w:cs="Times New Roman"/>
-          <w:color w:val="000000"/>
-          <w:sz w:val="24"/>
-          <w:szCs w:val="24"/>
-          <w:lang w:val="pt-BR"/>
-        </w:rPr>
-        <w:t>:</w:t>
+        <w:t>. A tabela inclui informações como curva de aprendizado, popularidade, flexibilidade e integração com FastAPI:</w:t>
       </w:r>
     </w:p>
     <w:tbl>
@@ -269,7 +201,6 @@
                 <w:szCs w:val="24"/>
               </w:rPr>
             </w:pPr>
-            <w:proofErr w:type="spellStart"/>
             <w:r>
               <w:rPr>
                 <w:rFonts w:ascii="Times New Roman" w:eastAsia="Times New Roman" w:hAnsi="Times New Roman" w:cs="Times New Roman"/>
@@ -281,7 +212,6 @@
               </w:rPr>
               <w:t>Prós</w:t>
             </w:r>
-            <w:proofErr w:type="spellEnd"/>
           </w:p>
         </w:tc>
         <w:tc>
@@ -359,7 +289,6 @@
                 <w:szCs w:val="24"/>
               </w:rPr>
             </w:pPr>
-            <w:proofErr w:type="spellStart"/>
             <w:r>
               <w:rPr>
                 <w:rFonts w:ascii="Times New Roman" w:eastAsia="Times New Roman" w:hAnsi="Times New Roman" w:cs="Times New Roman"/>
@@ -369,57 +298,8 @@
                 <w:sz w:val="24"/>
                 <w:szCs w:val="24"/>
               </w:rPr>
-              <w:t>Casos</w:t>
-            </w:r>
-            <w:proofErr w:type="spellEnd"/>
-            <w:r>
-              <w:rPr>
-                <w:rFonts w:ascii="Times New Roman" w:eastAsia="Times New Roman" w:hAnsi="Times New Roman" w:cs="Times New Roman"/>
-                <w:b/>
-                <w:bCs/>
-                <w:color w:val="000000"/>
-                <w:sz w:val="24"/>
-                <w:szCs w:val="24"/>
-              </w:rPr>
-              <w:t xml:space="preserve"> de </w:t>
-            </w:r>
-            <w:proofErr w:type="spellStart"/>
-            <w:r>
-              <w:rPr>
-                <w:rFonts w:ascii="Times New Roman" w:eastAsia="Times New Roman" w:hAnsi="Times New Roman" w:cs="Times New Roman"/>
-                <w:b/>
-                <w:bCs/>
-                <w:color w:val="000000"/>
-                <w:sz w:val="24"/>
-                <w:szCs w:val="24"/>
-              </w:rPr>
-              <w:t>Uso</w:t>
-            </w:r>
-            <w:proofErr w:type="spellEnd"/>
-            <w:r>
-              <w:rPr>
-                <w:rFonts w:ascii="Times New Roman" w:eastAsia="Times New Roman" w:hAnsi="Times New Roman" w:cs="Times New Roman"/>
-                <w:b/>
-                <w:bCs/>
-                <w:color w:val="000000"/>
-                <w:sz w:val="24"/>
-                <w:szCs w:val="24"/>
-              </w:rPr>
-              <w:t xml:space="preserve"> </w:t>
-            </w:r>
-            <w:proofErr w:type="spellStart"/>
-            <w:r>
-              <w:rPr>
-                <w:rFonts w:ascii="Times New Roman" w:eastAsia="Times New Roman" w:hAnsi="Times New Roman" w:cs="Times New Roman"/>
-                <w:b/>
-                <w:bCs/>
-                <w:color w:val="000000"/>
-                <w:sz w:val="24"/>
-                <w:szCs w:val="24"/>
-              </w:rPr>
-              <w:t>Recomendados</w:t>
-            </w:r>
-            <w:proofErr w:type="spellEnd"/>
+              <w:t>Casos de Uso Recomendados</w:t>
+            </w:r>
           </w:p>
         </w:tc>
       </w:tr>
@@ -453,7 +333,6 @@
                 <w:szCs w:val="24"/>
               </w:rPr>
             </w:pPr>
-            <w:proofErr w:type="spellStart"/>
             <w:r>
               <w:rPr>
                 <w:rFonts w:ascii="Times New Roman" w:eastAsia="Times New Roman" w:hAnsi="Times New Roman" w:cs="Times New Roman"/>
@@ -465,7 +344,6 @@
               </w:rPr>
               <w:t>Streamlit</w:t>
             </w:r>
-            <w:proofErr w:type="spellEnd"/>
           </w:p>
         </w:tc>
         <w:tc>
@@ -603,51 +481,7 @@
                 <w:lang w:val="pt-BR"/>
               </w:rPr>
               <w:br/>
-              <w:t xml:space="preserve">- Não ideal para </w:t>
-            </w:r>
-            <w:proofErr w:type="spellStart"/>
-            <w:r>
-              <w:rPr>
-                <w:rFonts w:ascii="Times New Roman" w:eastAsia="Times New Roman" w:hAnsi="Times New Roman" w:cs="Times New Roman"/>
-                <w:color w:val="000000"/>
-                <w:sz w:val="24"/>
-                <w:szCs w:val="24"/>
-                <w:lang w:val="pt-BR"/>
-              </w:rPr>
-              <w:t>SPAs</w:t>
-            </w:r>
-            <w:proofErr w:type="spellEnd"/>
-            <w:r>
-              <w:rPr>
-                <w:rFonts w:ascii="Times New Roman" w:eastAsia="Times New Roman" w:hAnsi="Times New Roman" w:cs="Times New Roman"/>
-                <w:color w:val="000000"/>
-                <w:sz w:val="24"/>
-                <w:szCs w:val="24"/>
-                <w:lang w:val="pt-BR"/>
-              </w:rPr>
-              <w:t xml:space="preserve"> (Single Page </w:t>
-            </w:r>
-            <w:proofErr w:type="spellStart"/>
-            <w:r>
-              <w:rPr>
-                <w:rFonts w:ascii="Times New Roman" w:eastAsia="Times New Roman" w:hAnsi="Times New Roman" w:cs="Times New Roman"/>
-                <w:color w:val="000000"/>
-                <w:sz w:val="24"/>
-                <w:szCs w:val="24"/>
-                <w:lang w:val="pt-BR"/>
-              </w:rPr>
-              <w:t>Applications</w:t>
-            </w:r>
-            <w:proofErr w:type="spellEnd"/>
-            <w:r>
-              <w:rPr>
-                <w:rFonts w:ascii="Times New Roman" w:eastAsia="Times New Roman" w:hAnsi="Times New Roman" w:cs="Times New Roman"/>
-                <w:color w:val="000000"/>
-                <w:sz w:val="24"/>
-                <w:szCs w:val="24"/>
-                <w:lang w:val="pt-BR"/>
-              </w:rPr>
-              <w:t xml:space="preserve">) </w:t>
+              <w:t xml:space="preserve">- Não ideal para SPAs (Single Page Applications) </w:t>
             </w:r>
           </w:p>
         </w:tc>
@@ -775,29 +609,7 @@
                 <w:szCs w:val="24"/>
                 <w:lang w:val="pt-BR"/>
               </w:rPr>
-              <w:t xml:space="preserve">- Baseado em </w:t>
-            </w:r>
-            <w:proofErr w:type="spellStart"/>
-            <w:r>
-              <w:rPr>
-                <w:rFonts w:ascii="Times New Roman" w:eastAsia="Times New Roman" w:hAnsi="Times New Roman" w:cs="Times New Roman"/>
-                <w:color w:val="000000"/>
-                <w:sz w:val="24"/>
-                <w:szCs w:val="24"/>
-                <w:lang w:val="pt-BR"/>
-              </w:rPr>
-              <w:t>Flask</w:t>
-            </w:r>
-            <w:proofErr w:type="spellEnd"/>
-            <w:r>
-              <w:rPr>
-                <w:rFonts w:ascii="Times New Roman" w:eastAsia="Times New Roman" w:hAnsi="Times New Roman" w:cs="Times New Roman"/>
-                <w:color w:val="000000"/>
-                <w:sz w:val="24"/>
-                <w:szCs w:val="24"/>
-                <w:lang w:val="pt-BR"/>
-              </w:rPr>
-              <w:t xml:space="preserve"> (fácil para quem conhece Python)</w:t>
+              <w:t>- Baseado em Flask (fácil para quem conhece Python)</w:t>
             </w:r>
             <w:r>
               <w:rPr>
@@ -819,20 +631,8 @@
                 <w:lang w:val="pt-BR"/>
               </w:rPr>
               <w:br/>
-              <w:t xml:space="preserve">- Suporte integrado a gráficos usando </w:t>
-            </w:r>
-            <w:proofErr w:type="spellStart"/>
-            <w:r>
-              <w:rPr>
-                <w:rFonts w:ascii="Times New Roman" w:eastAsia="Times New Roman" w:hAnsi="Times New Roman" w:cs="Times New Roman"/>
-                <w:color w:val="000000"/>
-                <w:sz w:val="24"/>
-                <w:szCs w:val="24"/>
-                <w:lang w:val="pt-BR"/>
-              </w:rPr>
-              <w:t>Plotly</w:t>
-            </w:r>
-            <w:proofErr w:type="spellEnd"/>
+              <w:t>- Suporte integrado a gráficos usando Plotly</w:t>
+            </w:r>
             <w:r>
               <w:rPr>
                 <w:rFonts w:ascii="Times New Roman" w:eastAsia="Times New Roman" w:hAnsi="Times New Roman" w:cs="Times New Roman"/>
@@ -895,20 +695,8 @@
                 <w:lang w:val="pt-BR"/>
               </w:rPr>
               <w:br/>
-              <w:t xml:space="preserve">- Menos flexível para aplicações generalizadas, como </w:t>
-            </w:r>
-            <w:proofErr w:type="spellStart"/>
-            <w:r>
-              <w:rPr>
-                <w:rFonts w:ascii="Times New Roman" w:eastAsia="Times New Roman" w:hAnsi="Times New Roman" w:cs="Times New Roman"/>
-                <w:color w:val="000000"/>
-                <w:sz w:val="24"/>
-                <w:szCs w:val="24"/>
-                <w:lang w:val="pt-BR"/>
-              </w:rPr>
-              <w:t>SPAs</w:t>
-            </w:r>
-            <w:proofErr w:type="spellEnd"/>
+              <w:t>- Menos flexível para aplicações generalizadas, como SPAs</w:t>
+            </w:r>
             <w:r>
               <w:rPr>
                 <w:rFonts w:ascii="Times New Roman" w:eastAsia="Times New Roman" w:hAnsi="Times New Roman" w:cs="Times New Roman"/>
@@ -995,7 +783,6 @@
                 <w:szCs w:val="24"/>
               </w:rPr>
             </w:pPr>
-            <w:proofErr w:type="spellStart"/>
             <w:r>
               <w:rPr>
                 <w:rFonts w:ascii="Times New Roman" w:eastAsia="Times New Roman" w:hAnsi="Times New Roman" w:cs="Times New Roman"/>
@@ -1007,7 +794,6 @@
               </w:rPr>
               <w:t>PyScript</w:t>
             </w:r>
-            <w:proofErr w:type="spellEnd"/>
           </w:p>
         </w:tc>
         <w:tc>
@@ -1081,51 +867,7 @@
                 <w:lang w:val="pt-BR"/>
               </w:rPr>
               <w:br/>
-              <w:t xml:space="preserve">- Baseado em </w:t>
-            </w:r>
-            <w:proofErr w:type="spellStart"/>
-            <w:r>
-              <w:rPr>
-                <w:rFonts w:ascii="Times New Roman" w:eastAsia="Times New Roman" w:hAnsi="Times New Roman" w:cs="Times New Roman"/>
-                <w:color w:val="000000"/>
-                <w:sz w:val="24"/>
-                <w:szCs w:val="24"/>
-                <w:lang w:val="pt-BR"/>
-              </w:rPr>
-              <w:t>WebAssembly</w:t>
-            </w:r>
-            <w:proofErr w:type="spellEnd"/>
-            <w:r>
-              <w:rPr>
-                <w:rFonts w:ascii="Times New Roman" w:eastAsia="Times New Roman" w:hAnsi="Times New Roman" w:cs="Times New Roman"/>
-                <w:color w:val="000000"/>
-                <w:sz w:val="24"/>
-                <w:szCs w:val="24"/>
-                <w:lang w:val="pt-BR"/>
-              </w:rPr>
-              <w:t xml:space="preserve"> (não depende de instalação do </w:t>
-            </w:r>
-            <w:proofErr w:type="spellStart"/>
-            <w:r>
-              <w:rPr>
-                <w:rFonts w:ascii="Times New Roman" w:eastAsia="Times New Roman" w:hAnsi="Times New Roman" w:cs="Times New Roman"/>
-                <w:color w:val="000000"/>
-                <w:sz w:val="24"/>
-                <w:szCs w:val="24"/>
-                <w:lang w:val="pt-BR"/>
-              </w:rPr>
-              <w:t>backend</w:t>
-            </w:r>
-            <w:proofErr w:type="spellEnd"/>
-            <w:r>
-              <w:rPr>
-                <w:rFonts w:ascii="Times New Roman" w:eastAsia="Times New Roman" w:hAnsi="Times New Roman" w:cs="Times New Roman"/>
-                <w:color w:val="000000"/>
-                <w:sz w:val="24"/>
-                <w:szCs w:val="24"/>
-                <w:lang w:val="pt-BR"/>
-              </w:rPr>
-              <w:t xml:space="preserve"> em alguns casos) </w:t>
+              <w:t xml:space="preserve">- Baseado em WebAssembly (não depende de instalação do backend em alguns casos) </w:t>
             </w:r>
           </w:p>
         </w:tc>
@@ -1200,29 +942,7 @@
                 <w:lang w:val="pt-BR"/>
               </w:rPr>
               <w:br/>
-              <w:t xml:space="preserve">- Performance depende de </w:t>
-            </w:r>
-            <w:proofErr w:type="spellStart"/>
-            <w:r>
-              <w:rPr>
-                <w:rFonts w:ascii="Times New Roman" w:eastAsia="Times New Roman" w:hAnsi="Times New Roman" w:cs="Times New Roman"/>
-                <w:color w:val="000000"/>
-                <w:sz w:val="24"/>
-                <w:szCs w:val="24"/>
-                <w:lang w:val="pt-BR"/>
-              </w:rPr>
-              <w:t>WebAssembly</w:t>
-            </w:r>
-            <w:proofErr w:type="spellEnd"/>
-            <w:r>
-              <w:rPr>
-                <w:rFonts w:ascii="Times New Roman" w:eastAsia="Times New Roman" w:hAnsi="Times New Roman" w:cs="Times New Roman"/>
-                <w:color w:val="000000"/>
-                <w:sz w:val="24"/>
-                <w:szCs w:val="24"/>
-                <w:lang w:val="pt-BR"/>
-              </w:rPr>
-              <w:t xml:space="preserve"> </w:t>
+              <w:t xml:space="preserve">- Performance depende de WebAssembly </w:t>
             </w:r>
           </w:p>
         </w:tc>
@@ -1264,29 +984,7 @@
                 <w:szCs w:val="24"/>
                 <w:lang w:val="pt-BR"/>
               </w:rPr>
-              <w:t>Aplicações simples baseadas em front-</w:t>
-            </w:r>
-            <w:proofErr w:type="spellStart"/>
-            <w:r>
-              <w:rPr>
-                <w:rFonts w:ascii="Times New Roman" w:eastAsia="Times New Roman" w:hAnsi="Times New Roman" w:cs="Times New Roman"/>
-                <w:color w:val="000000"/>
-                <w:sz w:val="24"/>
-                <w:szCs w:val="24"/>
-                <w:lang w:val="pt-BR"/>
-              </w:rPr>
-              <w:t>end</w:t>
-            </w:r>
-            <w:proofErr w:type="spellEnd"/>
-            <w:r>
-              <w:rPr>
-                <w:rFonts w:ascii="Times New Roman" w:eastAsia="Times New Roman" w:hAnsi="Times New Roman" w:cs="Times New Roman"/>
-                <w:color w:val="000000"/>
-                <w:sz w:val="24"/>
-                <w:szCs w:val="24"/>
-                <w:lang w:val="pt-BR"/>
-              </w:rPr>
-              <w:t xml:space="preserve"> com lógica Python no navegador</w:t>
+              <w:t>Aplicações simples baseadas em front-end com lógica Python no navegador</w:t>
             </w:r>
           </w:p>
         </w:tc>
@@ -1321,7 +1019,6 @@
                 <w:szCs w:val="24"/>
               </w:rPr>
             </w:pPr>
-            <w:proofErr w:type="spellStart"/>
             <w:r>
               <w:rPr>
                 <w:rFonts w:ascii="Times New Roman" w:eastAsia="Times New Roman" w:hAnsi="Times New Roman" w:cs="Times New Roman"/>
@@ -1333,7 +1030,6 @@
               </w:rPr>
               <w:t>JustPy</w:t>
             </w:r>
-            <w:proofErr w:type="spellEnd"/>
           </w:p>
         </w:tc>
         <w:tc>
@@ -1385,20 +1081,8 @@
                 <w:lang w:val="pt-BR"/>
               </w:rPr>
               <w:br/>
-              <w:t xml:space="preserve">- Altamente integrado com </w:t>
-            </w:r>
-            <w:proofErr w:type="spellStart"/>
-            <w:r>
-              <w:rPr>
-                <w:rFonts w:ascii="Times New Roman" w:eastAsia="Times New Roman" w:hAnsi="Times New Roman" w:cs="Times New Roman"/>
-                <w:color w:val="000000"/>
-                <w:sz w:val="24"/>
-                <w:szCs w:val="24"/>
-                <w:lang w:val="pt-BR"/>
-              </w:rPr>
-              <w:t>FastAPI</w:t>
-            </w:r>
-            <w:proofErr w:type="spellEnd"/>
+              <w:t>- Altamente integrado com FastAPI</w:t>
+            </w:r>
             <w:r>
               <w:rPr>
                 <w:rFonts w:ascii="Times New Roman" w:eastAsia="Times New Roman" w:hAnsi="Times New Roman" w:cs="Times New Roman"/>
@@ -1408,51 +1092,7 @@
                 <w:lang w:val="pt-BR"/>
               </w:rPr>
               <w:br/>
-              <w:t>- Server-</w:t>
-            </w:r>
-            <w:proofErr w:type="spellStart"/>
-            <w:r>
-              <w:rPr>
-                <w:rFonts w:ascii="Times New Roman" w:eastAsia="Times New Roman" w:hAnsi="Times New Roman" w:cs="Times New Roman"/>
-                <w:color w:val="000000"/>
-                <w:sz w:val="24"/>
-                <w:szCs w:val="24"/>
-                <w:lang w:val="pt-BR"/>
-              </w:rPr>
-              <w:t>side</w:t>
-            </w:r>
-            <w:proofErr w:type="spellEnd"/>
-            <w:r>
-              <w:rPr>
-                <w:rFonts w:ascii="Times New Roman" w:eastAsia="Times New Roman" w:hAnsi="Times New Roman" w:cs="Times New Roman"/>
-                <w:color w:val="000000"/>
-                <w:sz w:val="24"/>
-                <w:szCs w:val="24"/>
-                <w:lang w:val="pt-BR"/>
-              </w:rPr>
-              <w:t xml:space="preserve"> </w:t>
-            </w:r>
-            <w:proofErr w:type="spellStart"/>
-            <w:r>
-              <w:rPr>
-                <w:rFonts w:ascii="Times New Roman" w:eastAsia="Times New Roman" w:hAnsi="Times New Roman" w:cs="Times New Roman"/>
-                <w:color w:val="000000"/>
-                <w:sz w:val="24"/>
-                <w:szCs w:val="24"/>
-                <w:lang w:val="pt-BR"/>
-              </w:rPr>
-              <w:t>rendering</w:t>
-            </w:r>
-            <w:proofErr w:type="spellEnd"/>
-            <w:r>
-              <w:rPr>
-                <w:rFonts w:ascii="Times New Roman" w:eastAsia="Times New Roman" w:hAnsi="Times New Roman" w:cs="Times New Roman"/>
-                <w:color w:val="000000"/>
-                <w:sz w:val="24"/>
-                <w:szCs w:val="24"/>
-                <w:lang w:val="pt-BR"/>
-              </w:rPr>
-              <w:t xml:space="preserve"> otimizado para Python</w:t>
+              <w:t>- Server-side rendering otimizado para Python</w:t>
             </w:r>
             <w:r>
               <w:rPr>
@@ -1527,73 +1167,7 @@
                 <w:lang w:val="pt-BR"/>
               </w:rPr>
               <w:br/>
-              <w:t>- Menos personalizável do que frameworks de front-</w:t>
-            </w:r>
-            <w:proofErr w:type="spellStart"/>
-            <w:r>
-              <w:rPr>
-                <w:rFonts w:ascii="Times New Roman" w:eastAsia="Times New Roman" w:hAnsi="Times New Roman" w:cs="Times New Roman"/>
-                <w:color w:val="000000"/>
-                <w:sz w:val="24"/>
-                <w:szCs w:val="24"/>
-                <w:lang w:val="pt-BR"/>
-              </w:rPr>
-              <w:t>end</w:t>
-            </w:r>
-            <w:proofErr w:type="spellEnd"/>
-            <w:r>
-              <w:rPr>
-                <w:rFonts w:ascii="Times New Roman" w:eastAsia="Times New Roman" w:hAnsi="Times New Roman" w:cs="Times New Roman"/>
-                <w:color w:val="000000"/>
-                <w:sz w:val="24"/>
-                <w:szCs w:val="24"/>
-                <w:lang w:val="pt-BR"/>
-              </w:rPr>
-              <w:t xml:space="preserve"> em JS como </w:t>
-            </w:r>
-            <w:proofErr w:type="spellStart"/>
-            <w:r>
-              <w:rPr>
-                <w:rFonts w:ascii="Times New Roman" w:eastAsia="Times New Roman" w:hAnsi="Times New Roman" w:cs="Times New Roman"/>
-                <w:color w:val="000000"/>
-                <w:sz w:val="24"/>
-                <w:szCs w:val="24"/>
-                <w:lang w:val="pt-BR"/>
-              </w:rPr>
-              <w:t>React</w:t>
-            </w:r>
-            <w:proofErr w:type="spellEnd"/>
-            <w:r>
-              <w:rPr>
-                <w:rFonts w:ascii="Times New Roman" w:eastAsia="Times New Roman" w:hAnsi="Times New Roman" w:cs="Times New Roman"/>
-                <w:color w:val="000000"/>
-                <w:sz w:val="24"/>
-                <w:szCs w:val="24"/>
-                <w:lang w:val="pt-BR"/>
-              </w:rPr>
-              <w:t xml:space="preserve"> ou </w:t>
-            </w:r>
-            <w:proofErr w:type="spellStart"/>
-            <w:r>
-              <w:rPr>
-                <w:rFonts w:ascii="Times New Roman" w:eastAsia="Times New Roman" w:hAnsi="Times New Roman" w:cs="Times New Roman"/>
-                <w:color w:val="000000"/>
-                <w:sz w:val="24"/>
-                <w:szCs w:val="24"/>
-                <w:lang w:val="pt-BR"/>
-              </w:rPr>
-              <w:t>Vue</w:t>
-            </w:r>
-            <w:proofErr w:type="spellEnd"/>
-            <w:r>
-              <w:rPr>
-                <w:rFonts w:ascii="Times New Roman" w:eastAsia="Times New Roman" w:hAnsi="Times New Roman" w:cs="Times New Roman"/>
-                <w:color w:val="000000"/>
-                <w:sz w:val="24"/>
-                <w:szCs w:val="24"/>
-                <w:lang w:val="pt-BR"/>
-              </w:rPr>
-              <w:t xml:space="preserve"> </w:t>
+              <w:t xml:space="preserve">- Menos personalizável do que frameworks de front-end em JS como React ou Vue </w:t>
             </w:r>
           </w:p>
         </w:tc>
@@ -1635,29 +1209,7 @@
                 <w:szCs w:val="24"/>
                 <w:lang w:val="pt-BR"/>
               </w:rPr>
-              <w:t>Aplicações server-</w:t>
-            </w:r>
-            <w:proofErr w:type="spellStart"/>
-            <w:r>
-              <w:rPr>
-                <w:rFonts w:ascii="Times New Roman" w:eastAsia="Times New Roman" w:hAnsi="Times New Roman" w:cs="Times New Roman"/>
-                <w:color w:val="000000"/>
-                <w:sz w:val="24"/>
-                <w:szCs w:val="24"/>
-                <w:lang w:val="pt-BR"/>
-              </w:rPr>
-              <w:t>side</w:t>
-            </w:r>
-            <w:proofErr w:type="spellEnd"/>
-            <w:r>
-              <w:rPr>
-                <w:rFonts w:ascii="Times New Roman" w:eastAsia="Times New Roman" w:hAnsi="Times New Roman" w:cs="Times New Roman"/>
-                <w:color w:val="000000"/>
-                <w:sz w:val="24"/>
-                <w:szCs w:val="24"/>
-                <w:lang w:val="pt-BR"/>
-              </w:rPr>
-              <w:t xml:space="preserve"> simples e dinâmicas escritas inteiramente em Python</w:t>
+              <w:t>Aplicações server-side simples e dinâmicas escritas inteiramente em Python</w:t>
             </w:r>
           </w:p>
         </w:tc>
@@ -1711,27 +1263,7 @@
                 <w:sz w:val="24"/>
                 <w:szCs w:val="24"/>
               </w:rPr>
-              <w:t xml:space="preserve"> (Approach </w:t>
-            </w:r>
-            <w:proofErr w:type="spellStart"/>
-            <w:r>
-              <w:rPr>
-                <w:rFonts w:ascii="Times New Roman" w:eastAsia="Times New Roman" w:hAnsi="Times New Roman" w:cs="Times New Roman"/>
-                <w:color w:val="000000"/>
-                <w:sz w:val="24"/>
-                <w:szCs w:val="24"/>
-              </w:rPr>
-              <w:t>tradicional</w:t>
-            </w:r>
-            <w:proofErr w:type="spellEnd"/>
-            <w:r>
-              <w:rPr>
-                <w:rFonts w:ascii="Times New Roman" w:eastAsia="Times New Roman" w:hAnsi="Times New Roman" w:cs="Times New Roman"/>
-                <w:color w:val="000000"/>
-                <w:sz w:val="24"/>
-                <w:szCs w:val="24"/>
-              </w:rPr>
-              <w:t>)</w:t>
+              <w:t xml:space="preserve"> (Approach tradicional)</w:t>
             </w:r>
           </w:p>
         </w:tc>
@@ -1784,29 +1316,7 @@
                 <w:lang w:val="pt-BR"/>
               </w:rPr>
               <w:br/>
-              <w:t xml:space="preserve">- Uso de </w:t>
-            </w:r>
-            <w:proofErr w:type="spellStart"/>
-            <w:r>
-              <w:rPr>
-                <w:rFonts w:ascii="Times New Roman" w:eastAsia="Times New Roman" w:hAnsi="Times New Roman" w:cs="Times New Roman"/>
-                <w:color w:val="000000"/>
-                <w:sz w:val="24"/>
-                <w:szCs w:val="24"/>
-                <w:lang w:val="pt-BR"/>
-              </w:rPr>
-              <w:t>templates</w:t>
-            </w:r>
-            <w:proofErr w:type="spellEnd"/>
-            <w:r>
-              <w:rPr>
-                <w:rFonts w:ascii="Times New Roman" w:eastAsia="Times New Roman" w:hAnsi="Times New Roman" w:cs="Times New Roman"/>
-                <w:color w:val="000000"/>
-                <w:sz w:val="24"/>
-                <w:szCs w:val="24"/>
-                <w:lang w:val="pt-BR"/>
-              </w:rPr>
-              <w:t xml:space="preserve"> Jinja2 (muito flexíveis)</w:t>
+              <w:t>- Uso de templates Jinja2 (muito flexíveis)</w:t>
             </w:r>
             <w:r>
               <w:rPr>
@@ -1817,51 +1327,7 @@
                 <w:lang w:val="pt-BR"/>
               </w:rPr>
               <w:br/>
-              <w:t xml:space="preserve">- Boa integração com </w:t>
-            </w:r>
-            <w:proofErr w:type="spellStart"/>
-            <w:r>
-              <w:rPr>
-                <w:rFonts w:ascii="Times New Roman" w:eastAsia="Times New Roman" w:hAnsi="Times New Roman" w:cs="Times New Roman"/>
-                <w:color w:val="000000"/>
-                <w:sz w:val="24"/>
-                <w:szCs w:val="24"/>
-                <w:lang w:val="pt-BR"/>
-              </w:rPr>
-              <w:t>FastAPI</w:t>
-            </w:r>
-            <w:proofErr w:type="spellEnd"/>
-            <w:r>
-              <w:rPr>
-                <w:rFonts w:ascii="Times New Roman" w:eastAsia="Times New Roman" w:hAnsi="Times New Roman" w:cs="Times New Roman"/>
-                <w:color w:val="000000"/>
-                <w:sz w:val="24"/>
-                <w:szCs w:val="24"/>
-                <w:lang w:val="pt-BR"/>
-              </w:rPr>
-              <w:t xml:space="preserve"> para renderização de front-</w:t>
-            </w:r>
-            <w:proofErr w:type="spellStart"/>
-            <w:r>
-              <w:rPr>
-                <w:rFonts w:ascii="Times New Roman" w:eastAsia="Times New Roman" w:hAnsi="Times New Roman" w:cs="Times New Roman"/>
-                <w:color w:val="000000"/>
-                <w:sz w:val="24"/>
-                <w:szCs w:val="24"/>
-                <w:lang w:val="pt-BR"/>
-              </w:rPr>
-              <w:t>end</w:t>
-            </w:r>
-            <w:proofErr w:type="spellEnd"/>
-            <w:r>
-              <w:rPr>
-                <w:rFonts w:ascii="Times New Roman" w:eastAsia="Times New Roman" w:hAnsi="Times New Roman" w:cs="Times New Roman"/>
-                <w:color w:val="000000"/>
-                <w:sz w:val="24"/>
-                <w:szCs w:val="24"/>
-                <w:lang w:val="pt-BR"/>
-              </w:rPr>
-              <w:t xml:space="preserve"> e APIs </w:t>
+              <w:t xml:space="preserve">- Boa integração com FastAPI para renderização de front-end e APIs </w:t>
             </w:r>
           </w:p>
         </w:tc>
@@ -1967,20 +1433,8 @@
                 <w:szCs w:val="24"/>
                 <w:lang w:val="pt-BR"/>
               </w:rPr>
-              <w:t>Aplicações simples ou clássicas com renderização server-</w:t>
-            </w:r>
-            <w:proofErr w:type="spellStart"/>
-            <w:r>
-              <w:rPr>
-                <w:rFonts w:ascii="Times New Roman" w:eastAsia="Times New Roman" w:hAnsi="Times New Roman" w:cs="Times New Roman"/>
-                <w:color w:val="000000"/>
-                <w:sz w:val="24"/>
-                <w:szCs w:val="24"/>
-                <w:lang w:val="pt-BR"/>
-              </w:rPr>
-              <w:t>side</w:t>
-            </w:r>
-            <w:proofErr w:type="spellEnd"/>
+              <w:t>Aplicações simples ou clássicas com renderização server-side</w:t>
+            </w:r>
           </w:p>
         </w:tc>
       </w:tr>
@@ -2031,29 +1485,7 @@
           <w:szCs w:val="24"/>
           <w:lang w:val="pt-BR"/>
         </w:rPr>
-        <w:t>A escolha do framework front-</w:t>
-      </w:r>
-      <w:proofErr w:type="spellStart"/>
-      <w:r>
-        <w:rPr>
-          <w:rFonts w:ascii="Times New Roman" w:eastAsia="Times New Roman" w:hAnsi="Times New Roman" w:cs="Times New Roman"/>
-          <w:color w:val="000000"/>
-          <w:sz w:val="24"/>
-          <w:szCs w:val="24"/>
-          <w:lang w:val="pt-BR"/>
-        </w:rPr>
-        <w:t>end</w:t>
-      </w:r>
-      <w:proofErr w:type="spellEnd"/>
-      <w:r>
-        <w:rPr>
-          <w:rFonts w:ascii="Times New Roman" w:eastAsia="Times New Roman" w:hAnsi="Times New Roman" w:cs="Times New Roman"/>
-          <w:color w:val="000000"/>
-          <w:sz w:val="24"/>
-          <w:szCs w:val="24"/>
-          <w:lang w:val="pt-BR"/>
-        </w:rPr>
-        <w:t xml:space="preserve"> depende do tipo de aplicação que você deseja desenvolver:</w:t>
+        <w:t>A escolha do framework front-end depende do tipo de aplicação que você deseja desenvolver:</w:t>
       </w:r>
     </w:p>
     <w:p>
@@ -2071,7 +1503,6 @@
           <w:lang w:val="pt-BR"/>
         </w:rPr>
       </w:pPr>
-      <w:proofErr w:type="spellStart"/>
       <w:r>
         <w:rPr>
           <w:rFonts w:ascii="Times New Roman" w:eastAsia="Times New Roman" w:hAnsi="Times New Roman" w:cs="Times New Roman"/>
@@ -2082,20 +1513,7 @@
           <w:szCs w:val="24"/>
           <w:lang w:val="pt-BR"/>
         </w:rPr>
-        <w:t>Streamlit</w:t>
-      </w:r>
-      <w:proofErr w:type="spellEnd"/>
-      <w:r>
-        <w:rPr>
-          <w:rFonts w:ascii="Times New Roman" w:eastAsia="Times New Roman" w:hAnsi="Times New Roman" w:cs="Times New Roman"/>
-          <w:b/>
-          <w:bCs/>
-          <w:color w:val="000000"/>
-          <w:sz w:val="24"/>
-          <w:szCs w:val="24"/>
-          <w:lang w:val="pt-BR"/>
-        </w:rPr>
-        <w:t xml:space="preserve"> ou Dash</w:t>
+        <w:t>Streamlit ou Dash</w:t>
       </w:r>
       <w:r>
         <w:rPr>
@@ -2123,7 +1541,6 @@
           <w:lang w:val="pt-BR"/>
         </w:rPr>
       </w:pPr>
-      <w:proofErr w:type="spellStart"/>
       <w:r>
         <w:rPr>
           <w:rFonts w:ascii="Times New Roman" w:eastAsia="Times New Roman" w:hAnsi="Times New Roman" w:cs="Times New Roman"/>
@@ -2134,88 +1551,17 @@
           <w:szCs w:val="24"/>
           <w:lang w:val="pt-BR"/>
         </w:rPr>
-        <w:t>PyScript</w:t>
+        <w:t>PyScript ou JustPy</w:t>
       </w:r>
-      <w:proofErr w:type="spellEnd"/>
       <w:r>
         <w:rPr>
           <w:rFonts w:ascii="Times New Roman" w:eastAsia="Times New Roman" w:hAnsi="Times New Roman" w:cs="Times New Roman"/>
-          <w:b/>
-          <w:bCs/>
           <w:color w:val="000000"/>
           <w:sz w:val="24"/>
           <w:szCs w:val="24"/>
           <w:lang w:val="pt-BR"/>
         </w:rPr>
-        <w:t xml:space="preserve"> ou </w:t>
-      </w:r>
-      <w:proofErr w:type="spellStart"/>
-      <w:r>
-        <w:rPr>
-          <w:rFonts w:ascii="Times New Roman" w:eastAsia="Times New Roman" w:hAnsi="Times New Roman" w:cs="Times New Roman"/>
-          <w:b/>
-          <w:bCs/>
-          <w:color w:val="000000"/>
-          <w:sz w:val="24"/>
-          <w:szCs w:val="24"/>
-          <w:lang w:val="pt-BR"/>
-        </w:rPr>
-        <w:t>JustPy</w:t>
-      </w:r>
-      <w:proofErr w:type="spellEnd"/>
-      <w:r>
-        <w:rPr>
-          <w:rFonts w:ascii="Times New Roman" w:eastAsia="Times New Roman" w:hAnsi="Times New Roman" w:cs="Times New Roman"/>
-          <w:color w:val="000000"/>
-          <w:sz w:val="24"/>
-          <w:szCs w:val="24"/>
-          <w:lang w:val="pt-BR"/>
-        </w:rPr>
-        <w:t>: Se deseja utilizar apenas Python tanto para o front-</w:t>
-      </w:r>
-      <w:proofErr w:type="spellStart"/>
-      <w:r>
-        <w:rPr>
-          <w:rFonts w:ascii="Times New Roman" w:eastAsia="Times New Roman" w:hAnsi="Times New Roman" w:cs="Times New Roman"/>
-          <w:color w:val="000000"/>
-          <w:sz w:val="24"/>
-          <w:szCs w:val="24"/>
-          <w:lang w:val="pt-BR"/>
-        </w:rPr>
-        <w:t>end</w:t>
-      </w:r>
-      <w:proofErr w:type="spellEnd"/>
-      <w:r>
-        <w:rPr>
-          <w:rFonts w:ascii="Times New Roman" w:eastAsia="Times New Roman" w:hAnsi="Times New Roman" w:cs="Times New Roman"/>
-          <w:color w:val="000000"/>
-          <w:sz w:val="24"/>
-          <w:szCs w:val="24"/>
-          <w:lang w:val="pt-BR"/>
-        </w:rPr>
-        <w:t xml:space="preserve"> quanto para o </w:t>
-      </w:r>
-      <w:proofErr w:type="spellStart"/>
-      <w:r>
-        <w:rPr>
-          <w:rFonts w:ascii="Times New Roman" w:eastAsia="Times New Roman" w:hAnsi="Times New Roman" w:cs="Times New Roman"/>
-          <w:color w:val="000000"/>
-          <w:sz w:val="24"/>
-          <w:szCs w:val="24"/>
-          <w:lang w:val="pt-BR"/>
-        </w:rPr>
-        <w:t>back-end</w:t>
-      </w:r>
-      <w:proofErr w:type="spellEnd"/>
-      <w:r>
-        <w:rPr>
-          <w:rFonts w:ascii="Times New Roman" w:eastAsia="Times New Roman" w:hAnsi="Times New Roman" w:cs="Times New Roman"/>
-          <w:color w:val="000000"/>
-          <w:sz w:val="24"/>
-          <w:szCs w:val="24"/>
-          <w:lang w:val="pt-BR"/>
-        </w:rPr>
-        <w:t>, especialmente em projetos pequenos ou protótipos.</w:t>
+        <w:t>: Se deseja utilizar apenas Python tanto para o front-end quanto para o back-end, especialmente em projetos pequenos ou protótipos.</w:t>
       </w:r>
     </w:p>
     <w:p>
@@ -2233,7 +1579,6 @@
           <w:lang w:val="pt-BR"/>
         </w:rPr>
       </w:pPr>
-      <w:proofErr w:type="spellStart"/>
       <w:r>
         <w:rPr>
           <w:rFonts w:ascii="Times New Roman" w:eastAsia="Times New Roman" w:hAnsi="Times New Roman" w:cs="Times New Roman"/>
@@ -2244,9 +1589,40 @@
           <w:szCs w:val="24"/>
           <w:lang w:val="pt-BR"/>
         </w:rPr>
-        <w:t>Flask</w:t>
+        <w:t>Flask + Jinja2</w:t>
       </w:r>
-      <w:proofErr w:type="spellEnd"/>
+      <w:r>
+        <w:rPr>
+          <w:rFonts w:ascii="Times New Roman" w:eastAsia="Times New Roman" w:hAnsi="Times New Roman" w:cs="Times New Roman"/>
+          <w:color w:val="000000"/>
+          <w:sz w:val="24"/>
+          <w:szCs w:val="24"/>
+          <w:lang w:val="pt-BR"/>
+        </w:rPr>
+        <w:t>: Para aplicações tradicionais com geração de páginas dinâmicas no lado servidor, sem alta necessidade de interatividade.</w:t>
+      </w:r>
+    </w:p>
+    <w:p>
+      <w:pPr>
+        <w:spacing w:before="100" w:beforeAutospacing="1" w:after="100" w:afterAutospacing="1" w:line="240" w:lineRule="auto"/>
+        <w:rPr>
+          <w:rFonts w:ascii="Times New Roman" w:eastAsia="Times New Roman" w:hAnsi="Times New Roman" w:cs="Times New Roman"/>
+          <w:color w:val="000000"/>
+          <w:sz w:val="24"/>
+          <w:szCs w:val="24"/>
+          <w:lang w:val="pt-BR"/>
+        </w:rPr>
+      </w:pPr>
+      <w:r>
+        <w:rPr>
+          <w:rFonts w:ascii="Times New Roman" w:eastAsia="Times New Roman" w:hAnsi="Times New Roman" w:cs="Times New Roman"/>
+          <w:color w:val="000000"/>
+          <w:sz w:val="24"/>
+          <w:szCs w:val="24"/>
+          <w:lang w:val="pt-BR"/>
+        </w:rPr>
+        <w:t>Se sua necessidade for construir aplicações modernas, como SPAs (</w:t>
+      </w:r>
       <w:r>
         <w:rPr>
           <w:rFonts w:ascii="Times New Roman" w:eastAsia="Times New Roman" w:hAnsi="Times New Roman" w:cs="Times New Roman"/>
@@ -2257,7 +1633,7 @@
           <w:szCs w:val="24"/>
           <w:lang w:val="pt-BR"/>
         </w:rPr>
-        <w:t xml:space="preserve"> + Jinja2</w:t>
+        <w:t>Single Page Applications</w:t>
       </w:r>
       <w:r>
         <w:rPr>
@@ -2267,7 +1643,7 @@
           <w:szCs w:val="24"/>
           <w:lang w:val="pt-BR"/>
         </w:rPr>
-        <w:t>: Para aplicações tradicionais com geração de páginas dinâmicas no lado servidor, sem alta necessidade de interatividade.</w:t>
+        <w:t>), considere integrar seu back-end FastAPI com frameworks JavaScript (React, Vue ou Angular). Esses fornecem maior flexibilidade e interatividade, embora exijam conhecimentos em tecnologias fora do ecossistema Python.</w:t>
       </w:r>
     </w:p>
     <w:p>
@@ -2275,270 +1651,40 @@
         <w:spacing w:before="100" w:beforeAutospacing="1" w:after="100" w:afterAutospacing="1" w:line="240" w:lineRule="auto"/>
         <w:rPr>
           <w:rFonts w:ascii="Times New Roman" w:eastAsia="Times New Roman" w:hAnsi="Times New Roman" w:cs="Times New Roman"/>
+          <w:b/>
+          <w:bCs/>
           <w:color w:val="000000"/>
           <w:sz w:val="24"/>
           <w:szCs w:val="24"/>
           <w:lang w:val="pt-BR"/>
         </w:rPr>
       </w:pPr>
-      <w:r>
-        <w:rPr>
-          <w:rFonts w:ascii="Times New Roman" w:eastAsia="Times New Roman" w:hAnsi="Times New Roman" w:cs="Times New Roman"/>
+    </w:p>
+    <w:p>
+      <w:pPr>
+        <w:spacing w:before="100" w:beforeAutospacing="1" w:after="100" w:afterAutospacing="1" w:line="240" w:lineRule="auto"/>
+        <w:rPr>
+          <w:rFonts w:ascii="Times New Roman" w:eastAsia="Times New Roman" w:hAnsi="Times New Roman" w:cs="Times New Roman"/>
+          <w:b/>
+          <w:bCs/>
           <w:color w:val="000000"/>
           <w:sz w:val="24"/>
           <w:szCs w:val="24"/>
           <w:lang w:val="pt-BR"/>
         </w:rPr>
-        <w:t xml:space="preserve">Se sua necessidade for construir aplicações modernas, como </w:t>
-      </w:r>
-      <w:proofErr w:type="spellStart"/>
+      </w:pPr>
       <w:r>
         <w:rPr>
           <w:rFonts w:ascii="Times New Roman" w:eastAsia="Times New Roman" w:hAnsi="Times New Roman" w:cs="Times New Roman"/>
+          <w:b/>
+          <w:bCs/>
           <w:color w:val="000000"/>
           <w:sz w:val="24"/>
           <w:szCs w:val="24"/>
           <w:lang w:val="pt-BR"/>
         </w:rPr>
-        <w:t>SPAs</w:t>
+        <w:t>Curso de Streamlit - Aula 1 - Como Funciona Criar Apps e Sites com o Streamlit</w:t>
       </w:r>
-      <w:proofErr w:type="spellEnd"/>
-      <w:r>
-        <w:rPr>
-          <w:rFonts w:ascii="Times New Roman" w:eastAsia="Times New Roman" w:hAnsi="Times New Roman" w:cs="Times New Roman"/>
-          <w:color w:val="000000"/>
-          <w:sz w:val="24"/>
-          <w:szCs w:val="24"/>
-          <w:lang w:val="pt-BR"/>
-        </w:rPr>
-        <w:t xml:space="preserve"> (</w:t>
-      </w:r>
-      <w:r>
-        <w:rPr>
-          <w:rFonts w:ascii="Times New Roman" w:eastAsia="Times New Roman" w:hAnsi="Times New Roman" w:cs="Times New Roman"/>
-          <w:b/>
-          <w:bCs/>
-          <w:color w:val="000000"/>
-          <w:sz w:val="24"/>
-          <w:szCs w:val="24"/>
-          <w:lang w:val="pt-BR"/>
-        </w:rPr>
-        <w:t xml:space="preserve">Single Page </w:t>
-      </w:r>
-      <w:proofErr w:type="spellStart"/>
-      <w:r>
-        <w:rPr>
-          <w:rFonts w:ascii="Times New Roman" w:eastAsia="Times New Roman" w:hAnsi="Times New Roman" w:cs="Times New Roman"/>
-          <w:b/>
-          <w:bCs/>
-          <w:color w:val="000000"/>
-          <w:sz w:val="24"/>
-          <w:szCs w:val="24"/>
-          <w:lang w:val="pt-BR"/>
-        </w:rPr>
-        <w:t>Applications</w:t>
-      </w:r>
-      <w:proofErr w:type="spellEnd"/>
-      <w:r>
-        <w:rPr>
-          <w:rFonts w:ascii="Times New Roman" w:eastAsia="Times New Roman" w:hAnsi="Times New Roman" w:cs="Times New Roman"/>
-          <w:color w:val="000000"/>
-          <w:sz w:val="24"/>
-          <w:szCs w:val="24"/>
-          <w:lang w:val="pt-BR"/>
-        </w:rPr>
-        <w:t xml:space="preserve">), considere integrar seu </w:t>
-      </w:r>
-      <w:proofErr w:type="spellStart"/>
-      <w:r>
-        <w:rPr>
-          <w:rFonts w:ascii="Times New Roman" w:eastAsia="Times New Roman" w:hAnsi="Times New Roman" w:cs="Times New Roman"/>
-          <w:color w:val="000000"/>
-          <w:sz w:val="24"/>
-          <w:szCs w:val="24"/>
-          <w:lang w:val="pt-BR"/>
-        </w:rPr>
-        <w:t>back-end</w:t>
-      </w:r>
-      <w:proofErr w:type="spellEnd"/>
-      <w:r>
-        <w:rPr>
-          <w:rFonts w:ascii="Times New Roman" w:eastAsia="Times New Roman" w:hAnsi="Times New Roman" w:cs="Times New Roman"/>
-          <w:color w:val="000000"/>
-          <w:sz w:val="24"/>
-          <w:szCs w:val="24"/>
-          <w:lang w:val="pt-BR"/>
-        </w:rPr>
-        <w:t xml:space="preserve"> </w:t>
-      </w:r>
-      <w:proofErr w:type="spellStart"/>
-      <w:r>
-        <w:rPr>
-          <w:rFonts w:ascii="Times New Roman" w:eastAsia="Times New Roman" w:hAnsi="Times New Roman" w:cs="Times New Roman"/>
-          <w:color w:val="000000"/>
-          <w:sz w:val="24"/>
-          <w:szCs w:val="24"/>
-          <w:lang w:val="pt-BR"/>
-        </w:rPr>
-        <w:t>FastAPI</w:t>
-      </w:r>
-      <w:proofErr w:type="spellEnd"/>
-      <w:r>
-        <w:rPr>
-          <w:rFonts w:ascii="Times New Roman" w:eastAsia="Times New Roman" w:hAnsi="Times New Roman" w:cs="Times New Roman"/>
-          <w:color w:val="000000"/>
-          <w:sz w:val="24"/>
-          <w:szCs w:val="24"/>
-          <w:lang w:val="pt-BR"/>
-        </w:rPr>
-        <w:t xml:space="preserve"> com frameworks </w:t>
-      </w:r>
-      <w:proofErr w:type="spellStart"/>
-      <w:r>
-        <w:rPr>
-          <w:rFonts w:ascii="Times New Roman" w:eastAsia="Times New Roman" w:hAnsi="Times New Roman" w:cs="Times New Roman"/>
-          <w:color w:val="000000"/>
-          <w:sz w:val="24"/>
-          <w:szCs w:val="24"/>
-          <w:lang w:val="pt-BR"/>
-        </w:rPr>
-        <w:t>JavaScript</w:t>
-      </w:r>
-      <w:proofErr w:type="spellEnd"/>
-      <w:r>
-        <w:rPr>
-          <w:rFonts w:ascii="Times New Roman" w:eastAsia="Times New Roman" w:hAnsi="Times New Roman" w:cs="Times New Roman"/>
-          <w:color w:val="000000"/>
-          <w:sz w:val="24"/>
-          <w:szCs w:val="24"/>
-          <w:lang w:val="pt-BR"/>
-        </w:rPr>
-        <w:t xml:space="preserve"> (</w:t>
-      </w:r>
-      <w:proofErr w:type="spellStart"/>
-      <w:r>
-        <w:rPr>
-          <w:rFonts w:ascii="Times New Roman" w:eastAsia="Times New Roman" w:hAnsi="Times New Roman" w:cs="Times New Roman"/>
-          <w:color w:val="000000"/>
-          <w:sz w:val="24"/>
-          <w:szCs w:val="24"/>
-          <w:lang w:val="pt-BR"/>
-        </w:rPr>
-        <w:t>React</w:t>
-      </w:r>
-      <w:proofErr w:type="spellEnd"/>
-      <w:r>
-        <w:rPr>
-          <w:rFonts w:ascii="Times New Roman" w:eastAsia="Times New Roman" w:hAnsi="Times New Roman" w:cs="Times New Roman"/>
-          <w:color w:val="000000"/>
-          <w:sz w:val="24"/>
-          <w:szCs w:val="24"/>
-          <w:lang w:val="pt-BR"/>
-        </w:rPr>
-        <w:t xml:space="preserve">, </w:t>
-      </w:r>
-      <w:proofErr w:type="spellStart"/>
-      <w:r>
-        <w:rPr>
-          <w:rFonts w:ascii="Times New Roman" w:eastAsia="Times New Roman" w:hAnsi="Times New Roman" w:cs="Times New Roman"/>
-          <w:color w:val="000000"/>
-          <w:sz w:val="24"/>
-          <w:szCs w:val="24"/>
-          <w:lang w:val="pt-BR"/>
-        </w:rPr>
-        <w:t>Vue</w:t>
-      </w:r>
-      <w:proofErr w:type="spellEnd"/>
-      <w:r>
-        <w:rPr>
-          <w:rFonts w:ascii="Times New Roman" w:eastAsia="Times New Roman" w:hAnsi="Times New Roman" w:cs="Times New Roman"/>
-          <w:color w:val="000000"/>
-          <w:sz w:val="24"/>
-          <w:szCs w:val="24"/>
-          <w:lang w:val="pt-BR"/>
-        </w:rPr>
-        <w:t xml:space="preserve"> ou Angular). Esses fornecem maior flexibilidade e interatividade, embora exijam conhecimentos em tecnologias fora do ecossistema Python.</w:t>
-      </w:r>
-    </w:p>
-    <w:p>
-      <w:pPr>
-        <w:spacing w:before="100" w:beforeAutospacing="1" w:after="100" w:afterAutospacing="1" w:line="240" w:lineRule="auto"/>
-        <w:rPr>
-          <w:rFonts w:ascii="Times New Roman" w:eastAsia="Times New Roman" w:hAnsi="Times New Roman" w:cs="Times New Roman"/>
-          <w:b/>
-          <w:bCs/>
-          <w:color w:val="000000"/>
-          <w:sz w:val="24"/>
-          <w:szCs w:val="24"/>
-          <w:lang w:val="pt-BR"/>
-        </w:rPr>
-      </w:pPr>
-    </w:p>
-    <w:p>
-      <w:pPr>
-        <w:spacing w:before="100" w:beforeAutospacing="1" w:after="100" w:afterAutospacing="1" w:line="240" w:lineRule="auto"/>
-        <w:rPr>
-          <w:rFonts w:ascii="Times New Roman" w:eastAsia="Times New Roman" w:hAnsi="Times New Roman" w:cs="Times New Roman"/>
-          <w:b/>
-          <w:bCs/>
-          <w:color w:val="000000"/>
-          <w:sz w:val="24"/>
-          <w:szCs w:val="24"/>
-          <w:lang w:val="pt-BR"/>
-        </w:rPr>
-      </w:pPr>
-      <w:r>
-        <w:rPr>
-          <w:rFonts w:ascii="Times New Roman" w:eastAsia="Times New Roman" w:hAnsi="Times New Roman" w:cs="Times New Roman"/>
-          <w:b/>
-          <w:bCs/>
-          <w:color w:val="000000"/>
-          <w:sz w:val="24"/>
-          <w:szCs w:val="24"/>
-          <w:lang w:val="pt-BR"/>
-        </w:rPr>
-        <w:t xml:space="preserve">Curso de </w:t>
-      </w:r>
-      <w:proofErr w:type="spellStart"/>
-      <w:r>
-        <w:rPr>
-          <w:rFonts w:ascii="Times New Roman" w:eastAsia="Times New Roman" w:hAnsi="Times New Roman" w:cs="Times New Roman"/>
-          <w:b/>
-          <w:bCs/>
-          <w:color w:val="000000"/>
-          <w:sz w:val="24"/>
-          <w:szCs w:val="24"/>
-          <w:lang w:val="pt-BR"/>
-        </w:rPr>
-        <w:t>Streamlit</w:t>
-      </w:r>
-      <w:proofErr w:type="spellEnd"/>
-      <w:r>
-        <w:rPr>
-          <w:rFonts w:ascii="Times New Roman" w:eastAsia="Times New Roman" w:hAnsi="Times New Roman" w:cs="Times New Roman"/>
-          <w:b/>
-          <w:bCs/>
-          <w:color w:val="000000"/>
-          <w:sz w:val="24"/>
-          <w:szCs w:val="24"/>
-          <w:lang w:val="pt-BR"/>
-        </w:rPr>
-        <w:t xml:space="preserve"> - Aula 1 - Como Funciona Criar Apps e Sites com o </w:t>
-      </w:r>
-      <w:proofErr w:type="spellStart"/>
-      <w:r>
-        <w:rPr>
-          <w:rFonts w:ascii="Times New Roman" w:eastAsia="Times New Roman" w:hAnsi="Times New Roman" w:cs="Times New Roman"/>
-          <w:b/>
-          <w:bCs/>
-          <w:color w:val="000000"/>
-          <w:sz w:val="24"/>
-          <w:szCs w:val="24"/>
-          <w:lang w:val="pt-BR"/>
-        </w:rPr>
-        <w:t>Streamlit</w:t>
-      </w:r>
-      <w:proofErr w:type="spellEnd"/>
     </w:p>
     <w:p>
       <w:pPr>
@@ -2579,33 +1725,7 @@
           <w:szCs w:val="24"/>
           <w:lang w:val="pt-BR"/>
         </w:rPr>
-        <w:t xml:space="preserve">Curso de </w:t>
-      </w:r>
-      <w:proofErr w:type="spellStart"/>
-      <w:r>
-        <w:rPr>
-          <w:rFonts w:ascii="Times New Roman" w:eastAsia="Times New Roman" w:hAnsi="Times New Roman" w:cs="Times New Roman"/>
-          <w:b/>
-          <w:bCs/>
-          <w:color w:val="000000"/>
-          <w:sz w:val="24"/>
-          <w:szCs w:val="24"/>
-          <w:lang w:val="pt-BR"/>
-        </w:rPr>
-        <w:t>Streamlit</w:t>
-      </w:r>
-      <w:proofErr w:type="spellEnd"/>
-      <w:r>
-        <w:rPr>
-          <w:rFonts w:ascii="Times New Roman" w:eastAsia="Times New Roman" w:hAnsi="Times New Roman" w:cs="Times New Roman"/>
-          <w:b/>
-          <w:bCs/>
-          <w:color w:val="000000"/>
-          <w:sz w:val="24"/>
-          <w:szCs w:val="24"/>
-          <w:lang w:val="pt-BR"/>
-        </w:rPr>
-        <w:t xml:space="preserve"> - Aula 2 - Filtros e Gráficos</w:t>
+        <w:t>Curso de Streamlit - Aula 2 - Filtros e Gráficos</w:t>
       </w:r>
     </w:p>
     <w:p>
@@ -2647,74 +1767,8 @@
           <w:szCs w:val="24"/>
           <w:lang w:val="pt-BR"/>
         </w:rPr>
-        <w:t xml:space="preserve">Curso de </w:t>
+        <w:t>Curso de Streamlit - Aula 3 - Sidebar, Datas e Sliders</w:t>
       </w:r>
-      <w:proofErr w:type="spellStart"/>
-      <w:r>
-        <w:rPr>
-          <w:rFonts w:ascii="Times New Roman" w:eastAsia="Times New Roman" w:hAnsi="Times New Roman" w:cs="Times New Roman"/>
-          <w:b/>
-          <w:bCs/>
-          <w:color w:val="000000"/>
-          <w:sz w:val="24"/>
-          <w:szCs w:val="24"/>
-          <w:lang w:val="pt-BR"/>
-        </w:rPr>
-        <w:t>Streamlit</w:t>
-      </w:r>
-      <w:proofErr w:type="spellEnd"/>
-      <w:r>
-        <w:rPr>
-          <w:rFonts w:ascii="Times New Roman" w:eastAsia="Times New Roman" w:hAnsi="Times New Roman" w:cs="Times New Roman"/>
-          <w:b/>
-          <w:bCs/>
-          <w:color w:val="000000"/>
-          <w:sz w:val="24"/>
-          <w:szCs w:val="24"/>
-          <w:lang w:val="pt-BR"/>
-        </w:rPr>
-        <w:t xml:space="preserve"> - Aula 3 - </w:t>
-      </w:r>
-      <w:proofErr w:type="spellStart"/>
-      <w:r>
-        <w:rPr>
-          <w:rFonts w:ascii="Times New Roman" w:eastAsia="Times New Roman" w:hAnsi="Times New Roman" w:cs="Times New Roman"/>
-          <w:b/>
-          <w:bCs/>
-          <w:color w:val="000000"/>
-          <w:sz w:val="24"/>
-          <w:szCs w:val="24"/>
-          <w:lang w:val="pt-BR"/>
-        </w:rPr>
-        <w:t>Sidebar</w:t>
-      </w:r>
-      <w:proofErr w:type="spellEnd"/>
-      <w:r>
-        <w:rPr>
-          <w:rFonts w:ascii="Times New Roman" w:eastAsia="Times New Roman" w:hAnsi="Times New Roman" w:cs="Times New Roman"/>
-          <w:b/>
-          <w:bCs/>
-          <w:color w:val="000000"/>
-          <w:sz w:val="24"/>
-          <w:szCs w:val="24"/>
-          <w:lang w:val="pt-BR"/>
-        </w:rPr>
-        <w:t xml:space="preserve">, Datas e </w:t>
-      </w:r>
-      <w:proofErr w:type="spellStart"/>
-      <w:r>
-        <w:rPr>
-          <w:rFonts w:ascii="Times New Roman" w:eastAsia="Times New Roman" w:hAnsi="Times New Roman" w:cs="Times New Roman"/>
-          <w:b/>
-          <w:bCs/>
-          <w:color w:val="000000"/>
-          <w:sz w:val="24"/>
-          <w:szCs w:val="24"/>
-          <w:lang w:val="pt-BR"/>
-        </w:rPr>
-        <w:t>Sliders</w:t>
-      </w:r>
-      <w:proofErr w:type="spellEnd"/>
     </w:p>
     <w:p>
       <w:pPr>
@@ -2755,74 +1809,8 @@
           <w:szCs w:val="24"/>
           <w:lang w:val="pt-BR"/>
         </w:rPr>
-        <w:t xml:space="preserve">Curso de </w:t>
+        <w:t>Curso de Streamlit - Aula 3 - Sidebar, Datas e Sliders</w:t>
       </w:r>
-      <w:proofErr w:type="spellStart"/>
-      <w:r>
-        <w:rPr>
-          <w:rFonts w:ascii="Times New Roman" w:eastAsia="Times New Roman" w:hAnsi="Times New Roman" w:cs="Times New Roman"/>
-          <w:b/>
-          <w:bCs/>
-          <w:color w:val="000000"/>
-          <w:sz w:val="24"/>
-          <w:szCs w:val="24"/>
-          <w:lang w:val="pt-BR"/>
-        </w:rPr>
-        <w:t>Streamlit</w:t>
-      </w:r>
-      <w:proofErr w:type="spellEnd"/>
-      <w:r>
-        <w:rPr>
-          <w:rFonts w:ascii="Times New Roman" w:eastAsia="Times New Roman" w:hAnsi="Times New Roman" w:cs="Times New Roman"/>
-          <w:b/>
-          <w:bCs/>
-          <w:color w:val="000000"/>
-          <w:sz w:val="24"/>
-          <w:szCs w:val="24"/>
-          <w:lang w:val="pt-BR"/>
-        </w:rPr>
-        <w:t xml:space="preserve"> - Aula 3 - </w:t>
-      </w:r>
-      <w:proofErr w:type="spellStart"/>
-      <w:r>
-        <w:rPr>
-          <w:rFonts w:ascii="Times New Roman" w:eastAsia="Times New Roman" w:hAnsi="Times New Roman" w:cs="Times New Roman"/>
-          <w:b/>
-          <w:bCs/>
-          <w:color w:val="000000"/>
-          <w:sz w:val="24"/>
-          <w:szCs w:val="24"/>
-          <w:lang w:val="pt-BR"/>
-        </w:rPr>
-        <w:t>Sidebar</w:t>
-      </w:r>
-      <w:proofErr w:type="spellEnd"/>
-      <w:r>
-        <w:rPr>
-          <w:rFonts w:ascii="Times New Roman" w:eastAsia="Times New Roman" w:hAnsi="Times New Roman" w:cs="Times New Roman"/>
-          <w:b/>
-          <w:bCs/>
-          <w:color w:val="000000"/>
-          <w:sz w:val="24"/>
-          <w:szCs w:val="24"/>
-          <w:lang w:val="pt-BR"/>
-        </w:rPr>
-        <w:t xml:space="preserve">, Datas e </w:t>
-      </w:r>
-      <w:proofErr w:type="spellStart"/>
-      <w:r>
-        <w:rPr>
-          <w:rFonts w:ascii="Times New Roman" w:eastAsia="Times New Roman" w:hAnsi="Times New Roman" w:cs="Times New Roman"/>
-          <w:b/>
-          <w:bCs/>
-          <w:color w:val="000000"/>
-          <w:sz w:val="24"/>
-          <w:szCs w:val="24"/>
-          <w:lang w:val="pt-BR"/>
-        </w:rPr>
-        <w:t>Sliders</w:t>
-      </w:r>
-      <w:proofErr w:type="spellEnd"/>
     </w:p>
     <w:p>
       <w:pPr>
@@ -2863,33 +1851,7 @@
           <w:szCs w:val="24"/>
           <w:lang w:val="pt-BR"/>
         </w:rPr>
-        <w:t xml:space="preserve">Curso de </w:t>
-      </w:r>
-      <w:proofErr w:type="spellStart"/>
-      <w:r>
-        <w:rPr>
-          <w:rFonts w:ascii="Times New Roman" w:eastAsia="Times New Roman" w:hAnsi="Times New Roman" w:cs="Times New Roman"/>
-          <w:b/>
-          <w:bCs/>
-          <w:color w:val="000000"/>
-          <w:sz w:val="24"/>
-          <w:szCs w:val="24"/>
-          <w:lang w:val="pt-BR"/>
-        </w:rPr>
-        <w:t>Streamlit</w:t>
-      </w:r>
-      <w:proofErr w:type="spellEnd"/>
-      <w:r>
-        <w:rPr>
-          <w:rFonts w:ascii="Times New Roman" w:eastAsia="Times New Roman" w:hAnsi="Times New Roman" w:cs="Times New Roman"/>
-          <w:b/>
-          <w:bCs/>
-          <w:color w:val="000000"/>
-          <w:sz w:val="24"/>
-          <w:szCs w:val="24"/>
-          <w:lang w:val="pt-BR"/>
-        </w:rPr>
-        <w:t xml:space="preserve"> - Aula 4 - Dashboard Completo de Corretora de Ações</w:t>
+        <w:t>Curso de Streamlit - Aula 4 - Dashboard Completo de Corretora de Ações</w:t>
       </w:r>
     </w:p>
     <w:p>
@@ -2922,7 +1884,6 @@
           <w:lang w:val="pt-BR"/>
         </w:rPr>
       </w:pPr>
-      <w:proofErr w:type="spellStart"/>
       <w:r>
         <w:rPr>
           <w:rFonts w:ascii="Times New Roman" w:eastAsia="Times New Roman" w:hAnsi="Times New Roman" w:cs="Times New Roman"/>
@@ -2934,46 +1895,7 @@
           <w:lang w:val="pt-BR"/>
         </w:rPr>
         <w:lastRenderedPageBreak/>
-        <w:t>Deploy</w:t>
-      </w:r>
-      <w:proofErr w:type="spellEnd"/>
-      <w:r>
-        <w:rPr>
-          <w:rFonts w:ascii="Times New Roman" w:eastAsia="Times New Roman" w:hAnsi="Times New Roman" w:cs="Times New Roman"/>
-          <w:b/>
-          <w:bCs/>
-          <w:color w:val="000000"/>
-          <w:sz w:val="24"/>
-          <w:szCs w:val="24"/>
-          <w:lang w:val="pt-BR"/>
-        </w:rPr>
-        <w:t xml:space="preserve"> com o </w:t>
-      </w:r>
-      <w:proofErr w:type="spellStart"/>
-      <w:r>
-        <w:rPr>
-          <w:rFonts w:ascii="Times New Roman" w:eastAsia="Times New Roman" w:hAnsi="Times New Roman" w:cs="Times New Roman"/>
-          <w:b/>
-          <w:bCs/>
-          <w:color w:val="000000"/>
-          <w:sz w:val="24"/>
-          <w:szCs w:val="24"/>
-          <w:lang w:val="pt-BR"/>
-        </w:rPr>
-        <w:t>Streamlit</w:t>
-      </w:r>
-      <w:proofErr w:type="spellEnd"/>
-      <w:r>
-        <w:rPr>
-          <w:rFonts w:ascii="Times New Roman" w:eastAsia="Times New Roman" w:hAnsi="Times New Roman" w:cs="Times New Roman"/>
-          <w:b/>
-          <w:bCs/>
-          <w:color w:val="000000"/>
-          <w:sz w:val="24"/>
-          <w:szCs w:val="24"/>
-          <w:lang w:val="pt-BR"/>
-        </w:rPr>
-        <w:t xml:space="preserve"> - Como Colocar seu Site no Ar</w:t>
+        <w:t>Deploy com o Streamlit - Como Colocar seu Site no Ar</w:t>
       </w:r>
     </w:p>
     <w:p>
@@ -3081,29 +2003,7 @@
           <w:szCs w:val="30"/>
           <w:lang w:val="pt-BR"/>
         </w:rPr>
-        <w:t xml:space="preserve">Python + </w:t>
-      </w:r>
-      <w:proofErr w:type="spellStart"/>
-      <w:r>
-        <w:rPr>
-          <w:rFonts w:ascii="Arial" w:hAnsi="Arial" w:cs="Arial"/>
-          <w:color w:val="0F0F0F"/>
-          <w:sz w:val="30"/>
-          <w:szCs w:val="30"/>
-          <w:lang w:val="pt-BR"/>
-        </w:rPr>
-        <w:t>Streamlit</w:t>
-      </w:r>
-      <w:proofErr w:type="spellEnd"/>
-      <w:r>
-        <w:rPr>
-          <w:rFonts w:ascii="Arial" w:hAnsi="Arial" w:cs="Arial"/>
-          <w:color w:val="0F0F0F"/>
-          <w:sz w:val="30"/>
-          <w:szCs w:val="30"/>
-          <w:lang w:val="pt-BR"/>
-        </w:rPr>
-        <w:t xml:space="preserve"> – Aula 02 | Criando um Formulário de Cadastro com Validações em Python</w:t>
+        <w:t>Python + Streamlit – Aula 02 | Criando um Formulário de Cadastro com Validações em Python</w:t>
       </w:r>
     </w:p>
     <w:p>
@@ -3166,12 +2066,11 @@
           <w:lang w:val="pt-BR"/>
         </w:rPr>
       </w:pPr>
-      <w:bookmarkStart w:id="0" w:name="_GoBack"/>
-      <w:bookmarkEnd w:id="0"/>
-    </w:p>
-    <w:p>
-      <w:pPr>
-        <w:rPr>
+    </w:p>
+    <w:p>
+      <w:pPr>
+        <w:rPr>
+          <w:rStyle w:val="Hyperlink"/>
           <w:lang w:val="pt-BR"/>
         </w:rPr>
       </w:pPr>
@@ -3188,6 +2087,73 @@
     <w:p>
       <w:pPr>
         <w:rPr>
+          <w:rStyle w:val="Hyperlink"/>
+          <w:lang w:val="pt-BR"/>
+        </w:rPr>
+      </w:pPr>
+    </w:p>
+    <w:p>
+      <w:pPr>
+        <w:pStyle w:val="Ttulo1"/>
+        <w:shd w:val="clear" w:color="auto" w:fill="FFFFFF"/>
+        <w:spacing w:before="0" w:line="420" w:lineRule="atLeast"/>
+        <w:rPr>
+          <w:rFonts w:ascii="Arial" w:hAnsi="Arial" w:cs="Arial"/>
+          <w:color w:val="0F0F0F"/>
+          <w:sz w:val="18"/>
+          <w:szCs w:val="18"/>
+          <w:lang w:val="pt-BR"/>
+        </w:rPr>
+      </w:pPr>
+      <w:r>
+        <w:rPr>
+          <w:rFonts w:ascii="Arial" w:hAnsi="Arial" w:cs="Arial"/>
+          <w:color w:val="0F0F0F"/>
+          <w:sz w:val="18"/>
+          <w:szCs w:val="18"/>
+          <w:lang w:val="pt-BR"/>
+        </w:rPr>
+        <w:t>Video Reanto Augusto sobre b</w:t>
+      </w:r>
+      <w:r>
+        <w:rPr>
+          <w:rFonts w:ascii="Arial" w:hAnsi="Arial" w:cs="Arial"/>
+          <w:color w:val="0F0F0F"/>
+          <w:sz w:val="18"/>
+          <w:szCs w:val="18"/>
+          <w:lang w:val="pt-BR"/>
+        </w:rPr>
+        <w:t>usca no banco de dados full text search (minuto 22)</w:t>
+      </w:r>
+      <w:bookmarkStart w:id="0" w:name="_GoBack"/>
+      <w:bookmarkEnd w:id="0"/>
+    </w:p>
+    <w:p>
+      <w:pPr>
+        <w:rPr>
+          <w:lang w:val="pt-BR"/>
+        </w:rPr>
+      </w:pPr>
+      <w:hyperlink r:id="rId18" w:history="1">
+        <w:r>
+          <w:rPr>
+            <w:rStyle w:val="Hyperlink"/>
+            <w:lang w:val="pt-BR"/>
+          </w:rPr>
+          <w:t>https://youtu.be/UYOr-rpQs1I?si=BWGNdXrbO7pqzXUV</w:t>
+        </w:r>
+      </w:hyperlink>
+    </w:p>
+    <w:p>
+      <w:pPr>
+        <w:rPr>
+          <w:lang w:val="pt-BR"/>
+        </w:rPr>
+      </w:pPr>
+    </w:p>
+    <w:p>
+      <w:pPr>
+        <w:rPr>
           <w:lang w:val="pt-BR"/>
         </w:rPr>
       </w:pPr>
@@ -3228,7 +2194,7 @@
       </w:pPr>
     </w:p>
     <w:sectPr>
-      <w:headerReference w:type="default" r:id="rId18"/>
+      <w:headerReference w:type="default" r:id="rId19"/>
       <w:pgSz w:w="12240" w:h="15840"/>
       <w:pgMar w:top="720" w:right="720" w:bottom="720" w:left="720" w:header="708" w:footer="708" w:gutter="0"/>
       <w:cols w:space="708"/>
@@ -3298,7 +2264,6 @@
         <w:bCs/>
       </w:rPr>
     </w:pPr>
-    <w:proofErr w:type="spellStart"/>
     <w:r>
       <w:rPr>
         <w:b/>
@@ -3306,7 +2271,6 @@
       </w:rPr>
       <w:t>Anotações</w:t>
     </w:r>
-    <w:proofErr w:type="spellEnd"/>
   </w:p>
 </w:hdr>
 </file>

</xml_diff>